<commit_message>
Ajout de la gestion des pronoms et correction du Word
</commit_message>
<xml_diff>
--- a/Test_PlaceHolder.docx
+++ b/Test_PlaceHolder.docx
@@ -987,7 +987,23 @@
           <w:bCs/>
           <w:lang w:val="fr-FR"/>
         </w:rPr>
-        <w:t xml:space="preserve"> explique qu'il aime </w:t>
+        <w:t xml:space="preserve"> explique qu'</w:t>
+      </w:r>
+      <w:r>
+        <w:rPr>
+          <w:rFonts w:ascii="Times New Roman" w:hAnsi="Times New Roman"/>
+          <w:bCs/>
+          <w:lang w:val="fr-FR"/>
+        </w:rPr>
+        <w:t>{{PRONOM_SUJET}}</w:t>
+      </w:r>
+      <w:r>
+        <w:rPr>
+          <w:rFonts w:ascii="Times New Roman" w:hAnsi="Times New Roman"/>
+          <w:bCs/>
+          <w:lang w:val="fr-FR"/>
+        </w:rPr>
+        <w:t xml:space="preserve"> aime </w:t>
       </w:r>
       <w:r>
         <w:rPr>
@@ -1157,7 +1173,21 @@
           <w:rFonts w:ascii="Times New Roman" w:hAnsi="Times New Roman"/>
           <w:lang w:val="fr-FR"/>
         </w:rPr>
-        <w:t xml:space="preserve"> doit répéter des syllabes : il </w:t>
+        <w:t xml:space="preserve"> doit répéter des syllabes : </w:t>
+      </w:r>
+      <w:r>
+        <w:rPr>
+          <w:rFonts w:ascii="Times New Roman" w:hAnsi="Times New Roman"/>
+          <w:lang w:val="fr-FR"/>
+        </w:rPr>
+        <w:t>{{PRONOM_SUJET}}</w:t>
+      </w:r>
+      <w:r>
+        <w:rPr>
+          <w:rFonts w:ascii="Times New Roman" w:hAnsi="Times New Roman"/>
+          <w:lang w:val="fr-FR"/>
+        </w:rPr>
+        <w:t xml:space="preserve"> </w:t>
       </w:r>
       <w:proofErr w:type="spellStart"/>
       <w:r>
@@ -1347,7 +1377,14 @@
           <w:rFonts w:ascii="Times New Roman" w:hAnsi="Times New Roman"/>
           <w:lang w:val="fr-FR"/>
         </w:rPr>
-        <w:t xml:space="preserve">Il peut nommer </w:t>
+        <w:t>{{PRONOM_SUJET_MAJ}}</w:t>
+      </w:r>
+      <w:r>
+        <w:rPr>
+          <w:rFonts w:ascii="Times New Roman" w:hAnsi="Times New Roman"/>
+          <w:lang w:val="fr-FR"/>
+        </w:rPr>
+        <w:t xml:space="preserve"> peut nommer </w:t>
       </w:r>
       <w:r>
         <w:rPr>
@@ -1361,7 +1398,21 @@
           <w:rFonts w:ascii="Times New Roman" w:hAnsi="Times New Roman"/>
           <w:lang w:val="fr-FR"/>
         </w:rPr>
-        <w:t xml:space="preserve"> mots : il nomme </w:t>
+        <w:t xml:space="preserve"> mots : </w:t>
+      </w:r>
+      <w:r>
+        <w:rPr>
+          <w:rFonts w:ascii="Times New Roman" w:hAnsi="Times New Roman"/>
+          <w:lang w:val="fr-FR"/>
+        </w:rPr>
+        <w:t>{{PRONOM_SUJET}}</w:t>
+      </w:r>
+      <w:r>
+        <w:rPr>
+          <w:rFonts w:ascii="Times New Roman" w:hAnsi="Times New Roman"/>
+          <w:lang w:val="fr-FR"/>
+        </w:rPr>
+        <w:t xml:space="preserve"> nomme </w:t>
       </w:r>
       <w:proofErr w:type="gramStart"/>
       <w:r>
@@ -1417,7 +1468,21 @@
           <w:rFonts w:ascii="Times New Roman" w:hAnsi="Times New Roman"/>
           <w:lang w:val="fr-FR"/>
         </w:rPr>
-        <w:t xml:space="preserve"> il ne nomme pas «</w:t>
+        <w:t xml:space="preserve"> </w:t>
+      </w:r>
+      <w:r>
+        <w:rPr>
+          <w:rFonts w:ascii="Times New Roman" w:hAnsi="Times New Roman"/>
+          <w:lang w:val="fr-FR"/>
+        </w:rPr>
+        <w:t>{{PRONOM_SUJET}}</w:t>
+      </w:r>
+      <w:r>
+        <w:rPr>
+          <w:rFonts w:ascii="Times New Roman" w:hAnsi="Times New Roman"/>
+          <w:lang w:val="fr-FR"/>
+        </w:rPr>
+        <w:t xml:space="preserve"> ne nomme pas «</w:t>
       </w:r>
       <w:r>
         <w:rPr>
@@ -1456,7 +1521,22 @@
           <w:rFonts w:ascii="Times New Roman" w:hAnsi="Times New Roman"/>
           <w:lang w:val="fr-FR"/>
         </w:rPr>
-        <w:t>Score de {{SCORE_EVO_LEXICALE}}, score à {{ECART_EVO_LEXICALE}} des {{CLASSE_SCOLAIRE}}. Conclusion : {{PHRASE_EVO_LEXICALE}}</w:t>
+        <w:lastRenderedPageBreak/>
+        <w:t>Score de {{SCORE_EVO_LEXICALE}}, score à {{ECART_EVO_LEXICALE}} des {{CLASSE_SCOLAIRE}}.</w:t>
+      </w:r>
+      <w:r>
+        <w:rPr>
+          <w:rFonts w:ascii="Times New Roman" w:hAnsi="Times New Roman"/>
+          <w:lang w:val="fr-FR"/>
+        </w:rPr>
+        <w:br/>
+      </w:r>
+      <w:r>
+        <w:rPr>
+          <w:rFonts w:ascii="Times New Roman" w:hAnsi="Times New Roman"/>
+          <w:lang w:val="fr-FR"/>
+        </w:rPr>
+        <w:t>Conclusion : {{PHRASE_EVO_LEXICALE}}</w:t>
       </w:r>
     </w:p>
     <w:p>
@@ -1485,34 +1565,905 @@
           <w:b/>
           <w:lang w:val="fr-FR"/>
         </w:rPr>
+        <w:t>Compréhension lexicale</w:t>
+      </w:r>
+    </w:p>
+    <w:p>
+      <w:pPr>
+        <w:pStyle w:val="Standard"/>
+        <w:ind w:right="701"/>
+        <w:jc w:val="left"/>
+        <w:rPr>
+          <w:rFonts w:ascii="Times New Roman" w:hAnsi="Times New Roman"/>
+          <w:lang w:val="fr-FR"/>
+        </w:rPr>
+      </w:pPr>
+      <w:r>
+        <w:rPr>
+          <w:rFonts w:ascii="Times New Roman" w:hAnsi="Times New Roman"/>
+          <w:lang w:val="fr-FR"/>
+        </w:rPr>
+        <w:t xml:space="preserve">Il </w:t>
+      </w:r>
+      <w:r>
+        <w:rPr>
+          <w:rFonts w:ascii="Times New Roman" w:hAnsi="Times New Roman"/>
+          <w:lang w:val="fr-FR"/>
+        </w:rPr>
+        <w:t xml:space="preserve">faut montrer des images : </w:t>
+      </w:r>
+      <w:r>
+        <w:rPr>
+          <w:rFonts w:ascii="Times New Roman" w:hAnsi="Times New Roman"/>
+          <w:lang w:val="fr-FR"/>
+        </w:rPr>
+        <w:t>{{PRONOM_SUJET}}</w:t>
+      </w:r>
+      <w:r>
+        <w:rPr>
+          <w:rFonts w:ascii="Times New Roman" w:hAnsi="Times New Roman"/>
+          <w:lang w:val="fr-FR"/>
+        </w:rPr>
+        <w:t xml:space="preserve"> en a montré </w:t>
+      </w:r>
+      <w:r>
+        <w:rPr>
+          <w:rFonts w:ascii="Times New Roman" w:hAnsi="Times New Roman"/>
+          <w:lang w:val="fr-FR"/>
+        </w:rPr>
+        <w:t>{{SCORE_COMP_LEXICALE}}</w:t>
+      </w:r>
+      <w:r>
+        <w:rPr>
+          <w:rFonts w:ascii="Times New Roman" w:hAnsi="Times New Roman"/>
+          <w:lang w:val="fr-FR"/>
+        </w:rPr>
+        <w:t>.</w:t>
+      </w:r>
+      <w:r>
+        <w:rPr>
+          <w:rFonts w:ascii="Times New Roman" w:hAnsi="Times New Roman"/>
+          <w:lang w:val="fr-FR"/>
+        </w:rPr>
+        <w:br/>
+      </w:r>
+      <w:r>
+        <w:rPr>
+          <w:rFonts w:ascii="Times New Roman" w:hAnsi="Times New Roman"/>
+          <w:lang w:val="fr-FR"/>
+        </w:rPr>
+        <w:t>{{PRONOM_SUJET_MAJ}}</w:t>
+      </w:r>
+      <w:r>
+        <w:rPr>
+          <w:rFonts w:ascii="Times New Roman" w:hAnsi="Times New Roman"/>
+          <w:lang w:val="fr-FR"/>
+        </w:rPr>
+        <w:t xml:space="preserve"> désigne « </w:t>
+      </w:r>
+      <w:r>
+        <w:rPr>
+          <w:rFonts w:ascii="Times New Roman" w:hAnsi="Times New Roman"/>
+          <w:lang w:val="fr-FR"/>
+        </w:rPr>
+        <w:t>{{REUSSITES_COMP_LEXICALE}} », mais pas « {{ERREURS_COMP_</w:t>
+      </w:r>
+      <w:proofErr w:type="gramStart"/>
+      <w:r>
+        <w:rPr>
+          <w:rFonts w:ascii="Times New Roman" w:hAnsi="Times New Roman"/>
+          <w:lang w:val="fr-FR"/>
+        </w:rPr>
+        <w:t>LEXICALE</w:t>
+      </w:r>
+      <w:r>
+        <w:rPr>
+          <w:rFonts w:ascii="Times New Roman" w:hAnsi="Times New Roman"/>
+          <w:lang w:val="fr-FR"/>
+        </w:rPr>
+        <w:t> </w:t>
+      </w:r>
+      <w:r>
+        <w:rPr>
+          <w:rFonts w:ascii="Times New Roman" w:hAnsi="Times New Roman"/>
+          <w:lang w:val="fr-FR"/>
+        </w:rPr>
+        <w:t>}</w:t>
+      </w:r>
+      <w:proofErr w:type="gramEnd"/>
+      <w:r>
+        <w:rPr>
+          <w:rFonts w:ascii="Times New Roman" w:hAnsi="Times New Roman"/>
+          <w:lang w:val="fr-FR"/>
+        </w:rPr>
+        <w:t>} ».</w:t>
+      </w:r>
+      <w:r>
+        <w:rPr>
+          <w:rFonts w:ascii="Times New Roman" w:hAnsi="Times New Roman"/>
+          <w:lang w:val="fr-FR"/>
+        </w:rPr>
+        <w:br/>
+      </w:r>
+      <w:r>
+        <w:rPr>
+          <w:rFonts w:ascii="Times New Roman" w:hAnsi="Times New Roman"/>
+          <w:lang w:val="fr-FR"/>
+        </w:rPr>
+        <w:t>Score à {{ECART_COMP_LEXICALE}} en {{CLASSE_SCOLAIRE}}.</w:t>
+      </w:r>
+      <w:r>
+        <w:rPr>
+          <w:rFonts w:ascii="Times New Roman" w:hAnsi="Times New Roman"/>
+          <w:lang w:val="fr-FR"/>
+        </w:rPr>
+        <w:br/>
+      </w:r>
+      <w:r>
+        <w:rPr>
+          <w:rFonts w:ascii="Times New Roman" w:hAnsi="Times New Roman"/>
+          <w:lang w:val="fr-FR"/>
+        </w:rPr>
+        <w:t>Conclusion : {{PHRASE_COMP_LEXICALE}}</w:t>
+      </w:r>
+    </w:p>
+    <w:p>
+      <w:pPr>
+        <w:pStyle w:val="Standard"/>
+        <w:ind w:right="701"/>
+        <w:jc w:val="left"/>
+        <w:rPr>
+          <w:rFonts w:ascii="Times New Roman" w:hAnsi="Times New Roman"/>
+          <w:lang w:val="fr-FR"/>
+        </w:rPr>
+      </w:pPr>
+    </w:p>
+    <w:p>
+      <w:pPr>
+        <w:pStyle w:val="Standard"/>
+        <w:ind w:right="701"/>
+        <w:jc w:val="left"/>
+        <w:rPr>
+          <w:lang w:val="fr-FR"/>
+        </w:rPr>
+      </w:pPr>
+      <w:r>
+        <w:rPr>
+          <w:rFonts w:ascii="Times New Roman" w:hAnsi="Times New Roman"/>
+          <w:b/>
+          <w:lang w:val="fr-FR"/>
+        </w:rPr>
+        <w:t>Expression syntaxique</w:t>
+      </w:r>
+    </w:p>
+    <w:p>
+      <w:pPr>
+        <w:pStyle w:val="Standard"/>
+        <w:ind w:right="701"/>
+        <w:jc w:val="left"/>
+        <w:rPr>
+          <w:rFonts w:ascii="Times New Roman" w:hAnsi="Times New Roman"/>
+          <w:lang w:val="fr-FR"/>
+        </w:rPr>
+      </w:pPr>
+      <w:r>
+        <w:rPr>
+          <w:rFonts w:ascii="Times New Roman" w:hAnsi="Times New Roman"/>
+          <w:lang w:val="fr-FR"/>
+        </w:rPr>
+        <w:t>Il</w:t>
+      </w:r>
+      <w:r>
+        <w:rPr>
+          <w:rFonts w:ascii="Times New Roman" w:hAnsi="Times New Roman"/>
+          <w:lang w:val="fr-FR"/>
+        </w:rPr>
+        <w:t xml:space="preserve"> faut compléter des phrases : </w:t>
+      </w:r>
+      <w:r>
+        <w:rPr>
+          <w:rFonts w:ascii="Times New Roman" w:hAnsi="Times New Roman"/>
+          <w:lang w:val="fr-FR"/>
+        </w:rPr>
+        <w:t>{{PRONOM_SUJET}}</w:t>
+      </w:r>
+      <w:r>
+        <w:rPr>
+          <w:rFonts w:ascii="Times New Roman" w:hAnsi="Times New Roman"/>
+          <w:lang w:val="fr-FR"/>
+        </w:rPr>
+        <w:t xml:space="preserve"> ne connaît pas « {{ERREURS_EXP_SYNTAXIQUE}} ».</w:t>
+      </w:r>
+    </w:p>
+    <w:p>
+      <w:pPr>
+        <w:pStyle w:val="Standard"/>
+        <w:ind w:right="701"/>
+        <w:jc w:val="left"/>
+        <w:rPr>
+          <w:rFonts w:ascii="Times New Roman" w:hAnsi="Times New Roman"/>
+          <w:lang w:val="fr-FR"/>
+        </w:rPr>
+      </w:pPr>
+      <w:r>
+        <w:rPr>
+          <w:rFonts w:ascii="Times New Roman" w:hAnsi="Times New Roman"/>
+          <w:lang w:val="fr-FR"/>
+        </w:rPr>
+        <w:t>Score de {{SCORE_EXP_SYNTAXIQUE}}, score à {{ECART_EXP_SYNTAXIQUE}} des {{CLASSE_SCOLAIRE}}.</w:t>
+      </w:r>
+      <w:r>
+        <w:rPr>
+          <w:rFonts w:ascii="Times New Roman" w:hAnsi="Times New Roman"/>
+          <w:lang w:val="fr-FR"/>
+        </w:rPr>
+        <w:br/>
+      </w:r>
+      <w:r>
+        <w:rPr>
+          <w:rFonts w:ascii="Times New Roman" w:hAnsi="Times New Roman"/>
+          <w:lang w:val="fr-FR"/>
+        </w:rPr>
+        <w:t>Conclusion : {{PHRASE_EXP_SYNTAXIQUE}}</w:t>
+      </w:r>
+    </w:p>
+    <w:p>
+      <w:pPr>
+        <w:pStyle w:val="Standard"/>
+        <w:ind w:right="701"/>
+        <w:jc w:val="left"/>
+        <w:rPr>
+          <w:rFonts w:ascii="Times New Roman" w:hAnsi="Times New Roman"/>
+          <w:lang w:val="fr-FR"/>
+        </w:rPr>
+      </w:pPr>
+    </w:p>
+    <w:p>
+      <w:pPr>
+        <w:pStyle w:val="Standard"/>
+        <w:ind w:right="701"/>
+        <w:jc w:val="left"/>
+        <w:rPr>
+          <w:lang w:val="fr-FR"/>
+        </w:rPr>
+      </w:pPr>
+      <w:r>
+        <w:rPr>
+          <w:rFonts w:ascii="Times New Roman" w:hAnsi="Times New Roman"/>
+          <w:b/>
+          <w:lang w:val="fr-FR"/>
+        </w:rPr>
+        <w:t>Compréhension syntaxique</w:t>
+      </w:r>
+    </w:p>
+    <w:p>
+      <w:pPr>
+        <w:pStyle w:val="Standard"/>
+        <w:ind w:right="701"/>
+        <w:jc w:val="left"/>
+        <w:rPr>
+          <w:rFonts w:ascii="Times New Roman" w:hAnsi="Times New Roman"/>
+          <w:lang w:val="fr-FR"/>
+        </w:rPr>
+      </w:pPr>
+      <w:r>
+        <w:rPr>
+          <w:rFonts w:ascii="Times New Roman" w:hAnsi="Times New Roman"/>
+          <w:lang w:val="fr-FR"/>
+        </w:rPr>
+        <w:t xml:space="preserve">{{PRENOM_PATIENT}} doit comprendre des phrases et exécuter les ordres : </w:t>
+      </w:r>
+      <w:r>
+        <w:rPr>
+          <w:rFonts w:ascii="Times New Roman" w:hAnsi="Times New Roman"/>
+          <w:lang w:val="fr-FR"/>
+        </w:rPr>
+        <w:t>{{PRONOM_SUJET}}</w:t>
+      </w:r>
+      <w:r>
+        <w:rPr>
+          <w:rFonts w:ascii="Times New Roman" w:hAnsi="Times New Roman"/>
+          <w:lang w:val="fr-FR"/>
+        </w:rPr>
+        <w:t xml:space="preserve"> montre des formes et réussit dans {{SCORE_COMP_SYNTAXIQUE}} cas.</w:t>
+      </w:r>
+      <w:r>
+        <w:rPr>
+          <w:rFonts w:ascii="Times New Roman" w:hAnsi="Times New Roman"/>
+          <w:lang w:val="fr-FR"/>
+        </w:rPr>
+        <w:br/>
+      </w:r>
+      <w:r>
+        <w:rPr>
+          <w:rFonts w:ascii="Times New Roman" w:hAnsi="Times New Roman"/>
+          <w:lang w:val="fr-FR"/>
+        </w:rPr>
+        <w:t>Score de {{ECART_COMP_SYNTAXIQUE}} des {{CLASSE_SCOLAIRE}}.</w:t>
+      </w:r>
+    </w:p>
+    <w:p>
+      <w:pPr>
+        <w:pStyle w:val="Standard"/>
+        <w:ind w:right="701"/>
+        <w:jc w:val="left"/>
+        <w:rPr>
+          <w:rFonts w:ascii="Times New Roman" w:hAnsi="Times New Roman"/>
+          <w:lang w:val="fr-FR"/>
+        </w:rPr>
+      </w:pPr>
+      <w:r>
+        <w:rPr>
+          <w:rFonts w:ascii="Times New Roman" w:hAnsi="Times New Roman"/>
+          <w:lang w:val="fr-FR"/>
+        </w:rPr>
+        <w:t>Conclusion : {{PHRASE_COMP_SYNTAXIQUE}}</w:t>
+      </w:r>
+    </w:p>
+    <w:p>
+      <w:pPr>
+        <w:pStyle w:val="Standard"/>
+        <w:ind w:right="701"/>
+        <w:jc w:val="left"/>
+        <w:rPr>
+          <w:rFonts w:ascii="Times New Roman" w:hAnsi="Times New Roman"/>
+          <w:lang w:val="fr-FR"/>
+        </w:rPr>
+      </w:pPr>
+    </w:p>
+    <w:p>
+      <w:pPr>
+        <w:pStyle w:val="Standard"/>
+        <w:ind w:right="701"/>
+        <w:jc w:val="left"/>
+        <w:rPr>
+          <w:lang w:val="fr-FR"/>
+        </w:rPr>
+      </w:pPr>
+      <w:r>
+        <w:rPr>
+          <w:rFonts w:ascii="Times New Roman" w:hAnsi="Times New Roman"/>
+          <w:b/>
+          <w:lang w:val="fr-FR"/>
+        </w:rPr>
+        <w:t>Graphisme</w:t>
+      </w:r>
+    </w:p>
+    <w:p>
+      <w:pPr>
+        <w:pStyle w:val="Standard"/>
+        <w:ind w:right="701"/>
+        <w:jc w:val="left"/>
+        <w:rPr>
+          <w:rFonts w:ascii="Times New Roman" w:hAnsi="Times New Roman"/>
+          <w:lang w:val="fr-FR"/>
+        </w:rPr>
+      </w:pPr>
+      <w:r>
+        <w:rPr>
+          <w:rFonts w:ascii="Times New Roman" w:hAnsi="Times New Roman"/>
+          <w:lang w:val="fr-FR"/>
+        </w:rPr>
+        <w:t>Enfant {{LATERALITE}}, qui contrôle son graphisme : {{OBSERVATION_GRAPHISME}}. Le score de {{SCORE_GRAPHISME}}, score à {{ECART_GRAPHISME}} des {{CLASSE_SCOLAIRE}}. Réalisation du labyrinthe : {{OBSERVATION_LABYRINTHE}}. Score {{SCORE_LABYRINTHE}}, score à {{ECART_LABYRINTHE}} des {{CLASSE_SCOLAIRE}}.</w:t>
+      </w:r>
+    </w:p>
+    <w:p>
+      <w:pPr>
+        <w:pStyle w:val="Standard"/>
+        <w:ind w:right="701"/>
+        <w:jc w:val="left"/>
+        <w:rPr>
+          <w:rFonts w:ascii="Times New Roman" w:hAnsi="Times New Roman"/>
+          <w:lang w:val="fr-FR"/>
+        </w:rPr>
+      </w:pPr>
+    </w:p>
+    <w:p>
+      <w:pPr>
+        <w:pStyle w:val="Standard"/>
+        <w:ind w:right="701"/>
+        <w:jc w:val="left"/>
+        <w:rPr>
+          <w:lang w:val="fr-FR"/>
+        </w:rPr>
+      </w:pPr>
+      <w:r>
+        <w:rPr>
+          <w:rFonts w:ascii="Times New Roman" w:hAnsi="Times New Roman"/>
+          <w:b/>
+          <w:lang w:val="fr-FR"/>
+        </w:rPr>
+        <w:t>LANGAGE ECRIT</w:t>
+      </w:r>
+    </w:p>
+    <w:p>
+      <w:pPr>
+        <w:pStyle w:val="Standard"/>
+        <w:ind w:right="701"/>
+        <w:jc w:val="left"/>
+        <w:rPr>
+          <w:lang w:val="fr-FR"/>
+        </w:rPr>
+      </w:pPr>
+      <w:r>
+        <w:rPr>
+          <w:rFonts w:ascii="Times New Roman" w:hAnsi="Times New Roman"/>
+          <w:b/>
+          <w:lang w:val="fr-FR"/>
+        </w:rPr>
+        <w:t>Lecture</w:t>
+      </w:r>
+    </w:p>
+    <w:p>
+      <w:pPr>
+        <w:pStyle w:val="Standard"/>
+        <w:ind w:right="701"/>
+        <w:jc w:val="left"/>
+        <w:rPr>
+          <w:lang w:val="fr-FR"/>
+        </w:rPr>
+      </w:pPr>
+      <w:r>
+        <w:rPr>
+          <w:rFonts w:ascii="Times New Roman" w:hAnsi="Times New Roman"/>
+          <w:lang w:val="fr-FR"/>
+        </w:rPr>
+        <w:t xml:space="preserve">Lecture de lettres : score </w:t>
+      </w:r>
+      <w:r>
+        <w:rPr>
+          <w:rFonts w:ascii="Times New Roman" w:hAnsi="Times New Roman"/>
+          <w:lang w:val="fr-FR"/>
+        </w:rPr>
+        <w:t>{{SCORE_LECTURE_LETTRES}}</w:t>
+      </w:r>
+      <w:r>
+        <w:rPr>
+          <w:rFonts w:ascii="Times New Roman" w:hAnsi="Times New Roman"/>
+          <w:lang w:val="fr-FR"/>
+        </w:rPr>
+        <w:t>, sauf la lettre /</w:t>
+      </w:r>
+      <w:r>
+        <w:rPr>
+          <w:rFonts w:ascii="Times New Roman" w:hAnsi="Times New Roman"/>
+          <w:lang w:val="fr-FR"/>
+        </w:rPr>
+        <w:t>{{CONFUSIONS_LETTRES}}</w:t>
+      </w:r>
+      <w:r>
+        <w:rPr>
+          <w:rFonts w:ascii="Times New Roman" w:hAnsi="Times New Roman"/>
+          <w:lang w:val="fr-FR"/>
+        </w:rPr>
+        <w:t>.</w:t>
+      </w:r>
+    </w:p>
+    <w:p>
+      <w:pPr>
+        <w:pStyle w:val="Standard"/>
+        <w:ind w:right="701"/>
+        <w:jc w:val="left"/>
+        <w:rPr>
+          <w:lang w:val="fr-FR"/>
+        </w:rPr>
+      </w:pPr>
+      <w:r>
+        <w:rPr>
+          <w:rFonts w:ascii="Times New Roman" w:hAnsi="Times New Roman"/>
+          <w:lang w:val="fr-FR"/>
+        </w:rPr>
+        <w:t xml:space="preserve">Lecture de syllabes : score </w:t>
+      </w:r>
+      <w:r>
+        <w:rPr>
+          <w:rFonts w:ascii="Times New Roman" w:hAnsi="Times New Roman"/>
+          <w:lang w:val="fr-FR"/>
+        </w:rPr>
+        <w:t>{{SCORE_LECTURE_SYLLABES}}</w:t>
+      </w:r>
+    </w:p>
+    <w:p>
+      <w:pPr>
+        <w:pStyle w:val="Standard"/>
+        <w:ind w:right="701"/>
+        <w:jc w:val="left"/>
+        <w:rPr>
+          <w:lang w:val="fr-FR"/>
+        </w:rPr>
+      </w:pPr>
+      <w:r>
+        <w:rPr>
+          <w:rFonts w:ascii="Times New Roman" w:hAnsi="Times New Roman"/>
+          <w:lang w:val="fr-FR"/>
+        </w:rPr>
+        <w:t xml:space="preserve">Lecture de mots : score </w:t>
+      </w:r>
+      <w:r>
+        <w:rPr>
+          <w:rFonts w:ascii="Times New Roman" w:hAnsi="Times New Roman"/>
+          <w:lang w:val="fr-FR"/>
+        </w:rPr>
+        <w:t>{{SCORE_LECTURE_MOTS}}</w:t>
+      </w:r>
+    </w:p>
+    <w:p>
+      <w:pPr>
+        <w:pStyle w:val="Standard"/>
+        <w:ind w:right="701"/>
+        <w:jc w:val="left"/>
+        <w:rPr>
+          <w:lang w:val="fr-FR"/>
+        </w:rPr>
+      </w:pPr>
+      <w:r>
+        <w:rPr>
+          <w:rFonts w:ascii="Times New Roman" w:hAnsi="Times New Roman"/>
+          <w:lang w:val="fr-FR"/>
+        </w:rPr>
+        <w:t xml:space="preserve">Lecture de digraphes : score </w:t>
+      </w:r>
+      <w:r>
+        <w:rPr>
+          <w:rFonts w:ascii="Times New Roman" w:hAnsi="Times New Roman"/>
+          <w:lang w:val="fr-FR"/>
+        </w:rPr>
+        <w:t>{{SCORE_LECTURE_DIGRAPHES}}</w:t>
+      </w:r>
+      <w:r>
+        <w:rPr>
+          <w:rFonts w:ascii="Times New Roman" w:hAnsi="Times New Roman"/>
+          <w:lang w:val="fr-FR"/>
+        </w:rPr>
+        <w:t xml:space="preserve">, </w:t>
+      </w:r>
+      <w:r>
+        <w:rPr>
+          <w:rFonts w:ascii="Times New Roman" w:hAnsi="Times New Roman"/>
+          <w:lang w:val="fr-FR"/>
+        </w:rPr>
+        <w:t>(</w:t>
+      </w:r>
+      <w:r>
+        <w:rPr>
+          <w:rFonts w:ascii="Times New Roman" w:hAnsi="Times New Roman"/>
+          <w:lang w:val="fr-FR"/>
+        </w:rPr>
+        <w:t xml:space="preserve">sauf </w:t>
+      </w:r>
+      <w:r>
+        <w:rPr>
+          <w:rFonts w:ascii="Times New Roman" w:hAnsi="Times New Roman"/>
+          <w:lang w:val="fr-FR"/>
+        </w:rPr>
+        <w:t>{{ERREURS_DIGRAPHES}})</w:t>
+      </w:r>
+    </w:p>
+    <w:p>
+      <w:pPr>
+        <w:pStyle w:val="Standard"/>
+        <w:ind w:right="701"/>
+        <w:jc w:val="left"/>
+        <w:rPr>
+          <w:lang w:val="fr-FR"/>
+        </w:rPr>
+      </w:pPr>
+      <w:r>
+        <w:rPr>
+          <w:rFonts w:ascii="Times New Roman" w:hAnsi="Times New Roman"/>
+          <w:lang w:val="fr-FR"/>
+        </w:rPr>
+        <w:t xml:space="preserve">Lecture de trigraphes : score </w:t>
+      </w:r>
+      <w:r>
+        <w:rPr>
+          <w:rFonts w:ascii="Times New Roman" w:hAnsi="Times New Roman"/>
+          <w:lang w:val="fr-FR"/>
+        </w:rPr>
+        <w:t>{{SCORE_LECTURE_TRIGRAPHES}}</w:t>
+      </w:r>
+      <w:r>
+        <w:rPr>
+          <w:rFonts w:ascii="Times New Roman" w:hAnsi="Times New Roman"/>
+          <w:lang w:val="fr-FR"/>
+        </w:rPr>
+        <w:t xml:space="preserve">, </w:t>
+      </w:r>
+      <w:r>
+        <w:rPr>
+          <w:rFonts w:ascii="Times New Roman" w:hAnsi="Times New Roman"/>
+          <w:lang w:val="fr-FR"/>
+        </w:rPr>
+        <w:t>(</w:t>
+      </w:r>
+      <w:r>
+        <w:rPr>
+          <w:rFonts w:ascii="Times New Roman" w:hAnsi="Times New Roman"/>
+          <w:lang w:val="fr-FR"/>
+        </w:rPr>
+        <w:t xml:space="preserve">sauf </w:t>
+      </w:r>
+      <w:r>
+        <w:rPr>
+          <w:rFonts w:ascii="Times New Roman" w:hAnsi="Times New Roman"/>
+          <w:lang w:val="fr-FR"/>
+        </w:rPr>
+        <w:t>{{ERREURS_TRIGRAPHES}}</w:t>
+      </w:r>
+    </w:p>
+    <w:p>
+      <w:pPr>
+        <w:pStyle w:val="Standard"/>
+        <w:ind w:right="701"/>
+        <w:jc w:val="left"/>
+        <w:rPr>
+          <w:rFonts w:ascii="Times New Roman" w:hAnsi="Times New Roman"/>
+          <w:lang w:val="fr-FR"/>
+        </w:rPr>
+      </w:pPr>
+      <w:r>
+        <w:rPr>
+          <w:rFonts w:ascii="Times New Roman" w:hAnsi="Times New Roman"/>
+          <w:lang w:val="fr-FR"/>
+        </w:rPr>
+        <w:t xml:space="preserve">Lecture de phrases : score </w:t>
+      </w:r>
+      <w:r>
+        <w:rPr>
+          <w:rFonts w:ascii="Times New Roman" w:hAnsi="Times New Roman"/>
+          <w:lang w:val="fr-FR"/>
+        </w:rPr>
+        <w:t>{{SCORE_LECTURE_PHRASES}}</w:t>
+      </w:r>
+      <w:r>
+        <w:rPr>
+          <w:rFonts w:ascii="Times New Roman" w:hAnsi="Times New Roman"/>
+          <w:lang w:val="fr-FR"/>
+        </w:rPr>
+        <w:t xml:space="preserve">, </w:t>
+      </w:r>
+      <w:r>
+        <w:rPr>
+          <w:rFonts w:ascii="Times New Roman" w:hAnsi="Times New Roman"/>
+          <w:lang w:val="fr-FR"/>
+        </w:rPr>
+        <w:t>{{ERREURS_LECTURE_PHRASES}})</w:t>
+      </w:r>
+    </w:p>
+    <w:p>
+      <w:pPr>
+        <w:pStyle w:val="Standard"/>
+        <w:ind w:right="701"/>
+        <w:jc w:val="left"/>
+        <w:rPr>
+          <w:lang w:val="fr-FR"/>
+        </w:rPr>
+      </w:pPr>
+    </w:p>
+    <w:p>
+      <w:pPr>
+        <w:pStyle w:val="Standard"/>
+        <w:ind w:right="701"/>
+        <w:jc w:val="left"/>
+        <w:rPr>
+          <w:lang w:val="fr-FR"/>
+        </w:rPr>
+      </w:pPr>
+      <w:r>
+        <w:rPr>
+          <w:rFonts w:ascii="Times New Roman" w:hAnsi="Times New Roman"/>
+          <w:lang w:val="fr-FR"/>
+        </w:rPr>
+        <w:t xml:space="preserve">Score total : </w:t>
+      </w:r>
+      <w:r>
+        <w:rPr>
+          <w:rFonts w:ascii="Times New Roman" w:hAnsi="Times New Roman"/>
+          <w:b/>
+          <w:bCs/>
+          <w:lang w:val="fr-FR"/>
+        </w:rPr>
+        <w:t xml:space="preserve">score </w:t>
+      </w:r>
+      <w:r>
+        <w:rPr>
+          <w:rFonts w:ascii="Times New Roman" w:hAnsi="Times New Roman"/>
+          <w:b/>
+          <w:bCs/>
+          <w:lang w:val="fr-FR"/>
+        </w:rPr>
+        <w:t>{{SCORE_TOTAL_LECTURE}}</w:t>
+      </w:r>
+      <w:r>
+        <w:rPr>
+          <w:rFonts w:ascii="Times New Roman" w:hAnsi="Times New Roman"/>
+          <w:b/>
+          <w:bCs/>
+          <w:lang w:val="fr-FR"/>
+        </w:rPr>
+        <w:t xml:space="preserve">, </w:t>
+      </w:r>
+      <w:r>
+        <w:rPr>
+          <w:rFonts w:ascii="Times New Roman" w:hAnsi="Times New Roman"/>
+          <w:b/>
+          <w:bCs/>
+          <w:lang w:val="fr-FR"/>
+        </w:rPr>
+        <w:t>score à {{ECART_TOTAL_LECTURE}} des {{CLASSE_SCOLAIRE}}</w:t>
+      </w:r>
+      <w:r>
+        <w:rPr>
+          <w:rFonts w:ascii="Times New Roman" w:hAnsi="Times New Roman"/>
+          <w:b/>
+          <w:bCs/>
+          <w:lang w:val="fr-FR"/>
+        </w:rPr>
+        <w:t>.</w:t>
+      </w:r>
+    </w:p>
+    <w:p>
+      <w:pPr>
+        <w:pStyle w:val="Standard"/>
+        <w:ind w:right="701"/>
+        <w:jc w:val="left"/>
+        <w:rPr>
+          <w:b/>
+          <w:bCs/>
+          <w:lang w:val="fr-FR"/>
+        </w:rPr>
+      </w:pPr>
+    </w:p>
+    <w:p>
+      <w:pPr>
+        <w:pStyle w:val="Standard"/>
+        <w:ind w:right="701"/>
+        <w:jc w:val="left"/>
+        <w:rPr>
+          <w:lang w:val="fr-FR"/>
+        </w:rPr>
+      </w:pPr>
+      <w:r>
+        <w:rPr>
+          <w:rFonts w:ascii="Times New Roman" w:hAnsi="Times New Roman"/>
+          <w:b/>
+          <w:bCs/>
+          <w:lang w:val="fr-FR"/>
+        </w:rPr>
+        <w:t>Lecture d'un paragraphe </w:t>
+      </w:r>
+      <w:r>
+        <w:rPr>
+          <w:rFonts w:ascii="Times New Roman" w:hAnsi="Times New Roman"/>
+          <w:lang w:val="fr-FR"/>
+        </w:rPr>
+        <w:t>: le magicien des couleurs</w:t>
+      </w:r>
+    </w:p>
+    <w:p>
+      <w:pPr>
+        <w:pStyle w:val="Standard"/>
+        <w:ind w:right="701"/>
+        <w:jc w:val="left"/>
+        <w:rPr>
+          <w:lang w:val="fr-FR"/>
+        </w:rPr>
+      </w:pPr>
+      <w:r>
+        <w:rPr>
+          <w:rFonts w:ascii="Times New Roman" w:hAnsi="Times New Roman"/>
+          <w:lang w:val="fr-FR"/>
+        </w:rPr>
+        <w:t>{{PRENOM_PATIENT}}</w:t>
+      </w:r>
+      <w:r>
+        <w:rPr>
+          <w:rFonts w:ascii="Times New Roman" w:hAnsi="Times New Roman"/>
+          <w:lang w:val="fr-FR"/>
+        </w:rPr>
+        <w:t xml:space="preserve"> peut lire des phrases </w:t>
+      </w:r>
+      <w:r>
+        <w:rPr>
+          <w:rFonts w:ascii="Times New Roman" w:hAnsi="Times New Roman"/>
+          <w:lang w:val="fr-FR"/>
+        </w:rPr>
+        <w:t>{{OBSERVATION_LECTURE_TEXTE}}</w:t>
+      </w:r>
+      <w:r>
+        <w:rPr>
+          <w:rFonts w:ascii="Times New Roman" w:hAnsi="Times New Roman"/>
+          <w:lang w:val="fr-FR"/>
+        </w:rPr>
+        <w:t>.</w:t>
+      </w:r>
+    </w:p>
+    <w:p>
+      <w:pPr>
+        <w:pStyle w:val="Standard"/>
+        <w:ind w:right="701"/>
+        <w:jc w:val="left"/>
+        <w:rPr>
+          <w:rFonts w:ascii="Times New Roman" w:hAnsi="Times New Roman"/>
+          <w:lang w:val="fr-FR"/>
+        </w:rPr>
+      </w:pPr>
+      <w:r>
+        <w:rPr>
+          <w:rFonts w:ascii="Times New Roman" w:hAnsi="Times New Roman"/>
+          <w:lang w:val="fr-FR"/>
+        </w:rPr>
         <w:lastRenderedPageBreak/>
-        <w:t>Compréhension lexicale</w:t>
-      </w:r>
-    </w:p>
-    <w:p>
-      <w:pPr>
-        <w:pStyle w:val="Standard"/>
-        <w:ind w:right="701"/>
-        <w:jc w:val="left"/>
-        <w:rPr>
-          <w:rFonts w:ascii="Times New Roman" w:hAnsi="Times New Roman"/>
-          <w:lang w:val="fr-FR"/>
-        </w:rPr>
-      </w:pPr>
-      <w:r>
-        <w:rPr>
-          <w:rFonts w:ascii="Times New Roman" w:hAnsi="Times New Roman"/>
-          <w:lang w:val="fr-FR"/>
-        </w:rPr>
-        <w:t xml:space="preserve">Il faut montrer des images : il en a montré </w:t>
-      </w:r>
-      <w:r>
-        <w:rPr>
-          <w:rFonts w:ascii="Times New Roman" w:hAnsi="Times New Roman"/>
-          <w:lang w:val="fr-FR"/>
-        </w:rPr>
-        <w:t>{{SCORE_COMP_LEXICALE}}</w:t>
-      </w:r>
+        <w:t>{{PRONOM_SUJET_MAJ}}</w:t>
+      </w:r>
+      <w:r>
+        <w:rPr>
+          <w:rFonts w:ascii="Times New Roman" w:hAnsi="Times New Roman"/>
+          <w:lang w:val="fr-FR"/>
+        </w:rPr>
+        <w:t xml:space="preserve"> lit avec une qualité de lecture à </w:t>
+      </w:r>
+      <w:r>
+        <w:rPr>
+          <w:rFonts w:ascii="Times New Roman" w:hAnsi="Times New Roman"/>
+          <w:lang w:val="fr-FR"/>
+        </w:rPr>
+        <w:t>{{ECART_QUALITE_LECTURE}} des {{CLASSE_SCOLAIRE}}</w:t>
+      </w:r>
+      <w:r>
+        <w:rPr>
+          <w:rFonts w:ascii="Times New Roman" w:hAnsi="Times New Roman"/>
+          <w:lang w:val="fr-FR"/>
+        </w:rPr>
+        <w:t> :</w:t>
+      </w:r>
+    </w:p>
+    <w:p>
+      <w:pPr>
+        <w:pStyle w:val="Standard"/>
+        <w:ind w:right="701"/>
+        <w:jc w:val="left"/>
+        <w:rPr>
+          <w:lang w:val="fr-FR"/>
+        </w:rPr>
+      </w:pPr>
+      <w:r>
+        <w:rPr>
+          <w:rFonts w:ascii="Times New Roman" w:hAnsi="Times New Roman"/>
+          <w:lang w:val="fr-FR"/>
+        </w:rPr>
+        <w:t>{{PRONOM_SUJET}}</w:t>
+      </w:r>
+      <w:r>
+        <w:rPr>
+          <w:rFonts w:ascii="Times New Roman" w:hAnsi="Times New Roman"/>
+          <w:lang w:val="fr-FR"/>
+        </w:rPr>
+        <w:t xml:space="preserve"> a bien lu </w:t>
+      </w:r>
+      <w:r>
+        <w:rPr>
+          <w:rFonts w:ascii="Times New Roman" w:hAnsi="Times New Roman"/>
+          <w:lang w:val="fr-FR"/>
+        </w:rPr>
+        <w:t>{{MOTS_LUS_CORRECTEMENT</w:t>
+      </w:r>
+      <w:proofErr w:type="gramStart"/>
+      <w:r>
+        <w:rPr>
+          <w:rFonts w:ascii="Times New Roman" w:hAnsi="Times New Roman"/>
+          <w:lang w:val="fr-FR"/>
+        </w:rPr>
+        <w:t>}}</w:t>
+      </w:r>
+      <w:r>
+        <w:rPr>
+          <w:rFonts w:ascii="Times New Roman" w:hAnsi="Times New Roman"/>
+          <w:lang w:val="fr-FR"/>
+        </w:rPr>
+        <w:t>mots</w:t>
+      </w:r>
+      <w:proofErr w:type="gramEnd"/>
       <w:r>
         <w:rPr>
           <w:rFonts w:ascii="Times New Roman" w:hAnsi="Times New Roman"/>
@@ -1520,26 +2471,36 @@
         </w:rPr>
         <w:t>.</w:t>
       </w:r>
-      <w:r>
-        <w:rPr>
-          <w:rFonts w:ascii="Times New Roman" w:hAnsi="Times New Roman"/>
-          <w:lang w:val="fr-FR"/>
-        </w:rPr>
-        <w:br/>
-      </w:r>
-      <w:r>
-        <w:rPr>
-          <w:rFonts w:ascii="Times New Roman" w:hAnsi="Times New Roman"/>
-          <w:lang w:val="fr-FR"/>
-        </w:rPr>
-        <w:t>Il désigne « </w:t>
-      </w:r>
-      <w:r>
-        <w:rPr>
-          <w:rFonts w:ascii="Times New Roman" w:hAnsi="Times New Roman"/>
-          <w:lang w:val="fr-FR"/>
-        </w:rPr>
-        <w:t>{{REUSSITES_COMP_LEXICALE}} », mais pas « {{ERREURS_COMP_</w:t>
+    </w:p>
+    <w:p>
+      <w:pPr>
+        <w:pStyle w:val="Standard"/>
+        <w:ind w:right="701"/>
+        <w:jc w:val="left"/>
+        <w:rPr>
+          <w:lang w:val="fr-FR"/>
+        </w:rPr>
+      </w:pPr>
+      <w:r>
+        <w:rPr>
+          <w:rFonts w:ascii="Times New Roman" w:hAnsi="Times New Roman"/>
+          <w:lang w:val="fr-FR"/>
+        </w:rPr>
+        <w:t>{{PRONOM_SUJET_MAJ}}</w:t>
+      </w:r>
+      <w:r>
+        <w:rPr>
+          <w:rFonts w:ascii="Times New Roman" w:hAnsi="Times New Roman"/>
+          <w:lang w:val="fr-FR"/>
+        </w:rPr>
+        <w:t xml:space="preserve"> lit avec une vitesse de </w:t>
+      </w:r>
+      <w:r>
+        <w:rPr>
+          <w:rFonts w:ascii="Times New Roman" w:hAnsi="Times New Roman"/>
+          <w:lang w:val="fr-FR"/>
+        </w:rPr>
+        <w:t>{{ECART_VITESSE_LECTURE}} des {{CLASSE_</w:t>
       </w:r>
       <w:proofErr w:type="gramStart"/>
       <w:r>
@@ -1547,155 +2508,25 @@
           <w:rFonts w:ascii="Times New Roman" w:hAnsi="Times New Roman"/>
           <w:lang w:val="fr-FR"/>
         </w:rPr>
-        <w:t>LEXICALE</w:t>
-      </w:r>
-      <w:r>
-        <w:rPr>
-          <w:rFonts w:ascii="Times New Roman" w:hAnsi="Times New Roman"/>
-          <w:lang w:val="fr-FR"/>
-        </w:rPr>
-        <w:t> </w:t>
-      </w:r>
-      <w:r>
-        <w:rPr>
-          <w:rFonts w:ascii="Times New Roman" w:hAnsi="Times New Roman"/>
-          <w:lang w:val="fr-FR"/>
-        </w:rPr>
-        <w:t>}</w:t>
+        <w:t>SCOLAIRE}}.</w:t>
+      </w:r>
+      <w:r>
+        <w:rPr>
+          <w:rFonts w:ascii="Times New Roman" w:hAnsi="Times New Roman"/>
+          <w:lang w:val="fr-FR"/>
+        </w:rPr>
+        <w:t>.</w:t>
       </w:r>
       <w:proofErr w:type="gramEnd"/>
-      <w:r>
-        <w:rPr>
-          <w:rFonts w:ascii="Times New Roman" w:hAnsi="Times New Roman"/>
-          <w:lang w:val="fr-FR"/>
-        </w:rPr>
-        <w:t>} ».</w:t>
-      </w:r>
-      <w:r>
-        <w:rPr>
-          <w:rFonts w:ascii="Times New Roman" w:hAnsi="Times New Roman"/>
-          <w:lang w:val="fr-FR"/>
-        </w:rPr>
-        <w:br/>
-      </w:r>
-      <w:r>
-        <w:rPr>
-          <w:rFonts w:ascii="Times New Roman" w:hAnsi="Times New Roman"/>
-          <w:lang w:val="fr-FR"/>
-        </w:rPr>
-        <w:t>Score à {{ECART_COMP_LEXICALE}} en {{CLASSE_SCOLAIRE}}.</w:t>
-      </w:r>
-      <w:r>
-        <w:rPr>
-          <w:rFonts w:ascii="Times New Roman" w:hAnsi="Times New Roman"/>
-          <w:lang w:val="fr-FR"/>
-        </w:rPr>
-        <w:br/>
-      </w:r>
-      <w:r>
-        <w:rPr>
-          <w:rFonts w:ascii="Times New Roman" w:hAnsi="Times New Roman"/>
-          <w:lang w:val="fr-FR"/>
-        </w:rPr>
-        <w:t>Conclusion : {{PHRASE_COMP_LEXICALE}}</w:t>
-      </w:r>
-    </w:p>
-    <w:p>
-      <w:pPr>
-        <w:pStyle w:val="Standard"/>
-        <w:ind w:right="701"/>
-        <w:jc w:val="left"/>
-        <w:rPr>
-          <w:rFonts w:ascii="Times New Roman" w:hAnsi="Times New Roman"/>
-          <w:lang w:val="fr-FR"/>
-        </w:rPr>
-      </w:pPr>
-    </w:p>
-    <w:p>
-      <w:pPr>
-        <w:pStyle w:val="Standard"/>
-        <w:ind w:right="701"/>
-        <w:jc w:val="left"/>
-        <w:rPr>
-          <w:lang w:val="fr-FR"/>
-        </w:rPr>
-      </w:pPr>
-      <w:r>
-        <w:rPr>
-          <w:rFonts w:ascii="Times New Roman" w:hAnsi="Times New Roman"/>
+    </w:p>
+    <w:p>
+      <w:pPr>
+        <w:pStyle w:val="Standard"/>
+        <w:ind w:right="701"/>
+        <w:jc w:val="left"/>
+        <w:rPr>
           <w:b/>
-          <w:lang w:val="fr-FR"/>
-        </w:rPr>
-        <w:t>Expression syntaxique</w:t>
-      </w:r>
-    </w:p>
-    <w:p>
-      <w:pPr>
-        <w:pStyle w:val="Standard"/>
-        <w:ind w:right="701"/>
-        <w:jc w:val="left"/>
-        <w:rPr>
-          <w:rFonts w:ascii="Times New Roman" w:hAnsi="Times New Roman"/>
-          <w:lang w:val="fr-FR"/>
-        </w:rPr>
-      </w:pPr>
-      <w:r>
-        <w:rPr>
-          <w:rFonts w:ascii="Times New Roman" w:hAnsi="Times New Roman"/>
-          <w:lang w:val="fr-FR"/>
-        </w:rPr>
-        <w:t>Il faut compléter des phrases : il/elle ne connaît pas « {{ERREURS_EXP_SYNTAXIQUE}} ».</w:t>
-      </w:r>
-    </w:p>
-    <w:p>
-      <w:pPr>
-        <w:pStyle w:val="Standard"/>
-        <w:ind w:right="701"/>
-        <w:jc w:val="left"/>
-        <w:rPr>
-          <w:rFonts w:ascii="Times New Roman" w:hAnsi="Times New Roman"/>
-          <w:lang w:val="fr-FR"/>
-        </w:rPr>
-      </w:pPr>
-      <w:r>
-        <w:rPr>
-          <w:rFonts w:ascii="Times New Roman" w:hAnsi="Times New Roman"/>
-          <w:lang w:val="fr-FR"/>
-        </w:rPr>
-        <w:t>Score de {{SCORE_EXP_SYNTAXIQUE}}, score à {{ECART_EXP_SYNTAXIQUE}} des {{CLASSE_SCOLAIRE}}.</w:t>
-      </w:r>
-      <w:r>
-        <w:rPr>
-          <w:rFonts w:ascii="Times New Roman" w:hAnsi="Times New Roman"/>
-          <w:lang w:val="fr-FR"/>
-        </w:rPr>
-        <w:br/>
-      </w:r>
-      <w:r>
-        <w:rPr>
-          <w:rFonts w:ascii="Times New Roman" w:hAnsi="Times New Roman"/>
-          <w:lang w:val="fr-FR"/>
-        </w:rPr>
-        <w:t>Conclusion : {{PHRASE_EXP_SYNTAXIQUE}}</w:t>
-      </w:r>
-    </w:p>
-    <w:p>
-      <w:pPr>
-        <w:pStyle w:val="Standard"/>
-        <w:ind w:right="701"/>
-        <w:jc w:val="left"/>
-        <w:rPr>
-          <w:rFonts w:ascii="Times New Roman" w:hAnsi="Times New Roman"/>
-          <w:lang w:val="fr-FR"/>
-        </w:rPr>
-      </w:pPr>
-    </w:p>
-    <w:p>
-      <w:pPr>
-        <w:pStyle w:val="Standard"/>
-        <w:ind w:right="701"/>
-        <w:jc w:val="left"/>
-        <w:rPr>
+          <w:bCs/>
           <w:lang w:val="fr-FR"/>
         </w:rPr>
       </w:pPr>
@@ -1703,191 +2534,206 @@
         <w:rPr>
           <w:rFonts w:ascii="Times New Roman" w:hAnsi="Times New Roman"/>
           <w:b/>
-          <w:lang w:val="fr-FR"/>
-        </w:rPr>
-        <w:t>Compréhension syntaxique</w:t>
-      </w:r>
-    </w:p>
-    <w:p>
-      <w:pPr>
-        <w:pStyle w:val="Standard"/>
-        <w:ind w:right="701"/>
-        <w:jc w:val="left"/>
-        <w:rPr>
-          <w:rFonts w:ascii="Times New Roman" w:hAnsi="Times New Roman"/>
-          <w:lang w:val="fr-FR"/>
-        </w:rPr>
-      </w:pPr>
-      <w:r>
-        <w:rPr>
-          <w:rFonts w:ascii="Times New Roman" w:hAnsi="Times New Roman"/>
-          <w:lang w:val="fr-FR"/>
-        </w:rPr>
-        <w:t>{{PRENOM_PATIENT}} doit comprendre des phrases et exécuter les ordres : il/elle montre des formes et réussit dans {{SCORE_COMP_SYNTAXIQUE}} cas.</w:t>
-      </w:r>
-      <w:r>
-        <w:rPr>
-          <w:rFonts w:ascii="Times New Roman" w:hAnsi="Times New Roman"/>
-          <w:lang w:val="fr-FR"/>
-        </w:rPr>
-        <w:br/>
-      </w:r>
-      <w:r>
-        <w:rPr>
-          <w:rFonts w:ascii="Times New Roman" w:hAnsi="Times New Roman"/>
-          <w:lang w:val="fr-FR"/>
-        </w:rPr>
-        <w:t>Score de {{ECART_COMP_SYNTAXIQUE}} des {{CLASSE_SCOLAIRE}}.</w:t>
-      </w:r>
-    </w:p>
-    <w:p>
-      <w:pPr>
-        <w:pStyle w:val="Standard"/>
-        <w:ind w:right="701"/>
-        <w:jc w:val="left"/>
-        <w:rPr>
-          <w:rFonts w:ascii="Times New Roman" w:hAnsi="Times New Roman"/>
-          <w:lang w:val="fr-FR"/>
-        </w:rPr>
-      </w:pPr>
-      <w:r>
-        <w:rPr>
-          <w:rFonts w:ascii="Times New Roman" w:hAnsi="Times New Roman"/>
-          <w:lang w:val="fr-FR"/>
-        </w:rPr>
-        <w:t>Conclusion : {{PHRASE_COMP_SYNTAXIQUE}}</w:t>
-      </w:r>
-    </w:p>
-    <w:p>
-      <w:pPr>
-        <w:pStyle w:val="Standard"/>
-        <w:ind w:right="701"/>
-        <w:jc w:val="left"/>
-        <w:rPr>
-          <w:rFonts w:ascii="Times New Roman" w:hAnsi="Times New Roman"/>
-          <w:lang w:val="fr-FR"/>
-        </w:rPr>
-      </w:pPr>
-    </w:p>
-    <w:p>
-      <w:pPr>
-        <w:pStyle w:val="Standard"/>
-        <w:ind w:right="701"/>
-        <w:jc w:val="left"/>
-        <w:rPr>
-          <w:lang w:val="fr-FR"/>
-        </w:rPr>
-      </w:pPr>
+          <w:bCs/>
+          <w:lang w:val="fr-FR"/>
+        </w:rPr>
+        <w:t>{{PRONOM_SUJET_MAJ}}</w:t>
+      </w:r>
       <w:r>
         <w:rPr>
           <w:rFonts w:ascii="Times New Roman" w:hAnsi="Times New Roman"/>
           <w:b/>
-          <w:lang w:val="fr-FR"/>
-        </w:rPr>
-        <w:t>Graphisme</w:t>
-      </w:r>
-    </w:p>
-    <w:p>
-      <w:pPr>
-        <w:pStyle w:val="Standard"/>
-        <w:ind w:right="701"/>
-        <w:jc w:val="left"/>
-        <w:rPr>
-          <w:rFonts w:ascii="Times New Roman" w:hAnsi="Times New Roman"/>
-          <w:lang w:val="fr-FR"/>
-        </w:rPr>
-      </w:pPr>
-      <w:r>
-        <w:rPr>
-          <w:rFonts w:ascii="Times New Roman" w:hAnsi="Times New Roman"/>
-          <w:lang w:val="fr-FR"/>
-        </w:rPr>
-        <w:t>Enfant {{LATERALITE}}, qui contrôle son graphisme : {{OBSERVATION_GRAPHISME}}. Le score de {{SCORE_GRAPHISME}}, score à {{ECART_GRAPHISME}} des {{CLASSE_SCOLAIRE}}. Réalisation du labyrinthe : {{OBSERVATION_LABYRINTHE}}. Score {{SCORE_LABYRINTHE}}, score à {{ECART_LABYRINTHE}} des {{CLASSE_SCOLAIRE}}.</w:t>
-      </w:r>
-    </w:p>
-    <w:p>
-      <w:pPr>
-        <w:pStyle w:val="Standard"/>
-        <w:ind w:right="701"/>
-        <w:jc w:val="left"/>
-        <w:rPr>
-          <w:rFonts w:ascii="Times New Roman" w:hAnsi="Times New Roman"/>
-          <w:lang w:val="fr-FR"/>
-        </w:rPr>
-      </w:pPr>
-    </w:p>
-    <w:p>
-      <w:pPr>
-        <w:pStyle w:val="Standard"/>
-        <w:ind w:right="701"/>
-        <w:jc w:val="left"/>
-        <w:rPr>
-          <w:lang w:val="fr-FR"/>
-        </w:rPr>
-      </w:pPr>
+          <w:bCs/>
+          <w:lang w:val="fr-FR"/>
+        </w:rPr>
+        <w:t xml:space="preserve"> comprend le paragraphe avec un score </w:t>
+      </w:r>
       <w:r>
         <w:rPr>
           <w:rFonts w:ascii="Times New Roman" w:hAnsi="Times New Roman"/>
           <w:b/>
-          <w:lang w:val="fr-FR"/>
-        </w:rPr>
-        <w:t>LANGAGE ECRIT</w:t>
-      </w:r>
-    </w:p>
-    <w:p>
-      <w:pPr>
-        <w:pStyle w:val="Standard"/>
-        <w:ind w:right="701"/>
-        <w:jc w:val="left"/>
-        <w:rPr>
-          <w:lang w:val="fr-FR"/>
-        </w:rPr>
-      </w:pPr>
-      <w:r>
+          <w:bCs/>
+          <w:lang w:val="fr-FR"/>
+        </w:rPr>
+        <w:t>{{SCORE_COMP_LECTURE_TEXTE}}, score à {{ECART_COMP_LECTURE_TEXTE}} des {{CLASSE_SCOLAIRE}}.</w:t>
+      </w:r>
+    </w:p>
+    <w:p>
+      <w:pPr>
+        <w:pStyle w:val="Standard"/>
+        <w:ind w:right="701"/>
+        <w:jc w:val="left"/>
         <w:rPr>
           <w:rFonts w:ascii="Times New Roman" w:hAnsi="Times New Roman"/>
           <w:b/>
-          <w:lang w:val="fr-FR"/>
-        </w:rPr>
-        <w:t>Lecture</w:t>
-      </w:r>
-    </w:p>
-    <w:p>
-      <w:pPr>
-        <w:pStyle w:val="Standard"/>
-        <w:ind w:right="701"/>
-        <w:jc w:val="left"/>
-        <w:rPr>
-          <w:lang w:val="fr-FR"/>
-        </w:rPr>
-      </w:pPr>
-      <w:r>
-        <w:rPr>
-          <w:rFonts w:ascii="Times New Roman" w:hAnsi="Times New Roman"/>
-          <w:lang w:val="fr-FR"/>
-        </w:rPr>
-        <w:t xml:space="preserve">Lecture de lettres : score </w:t>
-      </w:r>
-      <w:r>
-        <w:rPr>
-          <w:rFonts w:ascii="Times New Roman" w:hAnsi="Times New Roman"/>
-          <w:lang w:val="fr-FR"/>
-        </w:rPr>
-        <w:t>{{SCORE_LECTURE_LETTRES}}</w:t>
-      </w:r>
-      <w:r>
-        <w:rPr>
-          <w:rFonts w:ascii="Times New Roman" w:hAnsi="Times New Roman"/>
-          <w:lang w:val="fr-FR"/>
-        </w:rPr>
-        <w:t>, sauf la lettre /</w:t>
-      </w:r>
-      <w:r>
-        <w:rPr>
-          <w:rFonts w:ascii="Times New Roman" w:hAnsi="Times New Roman"/>
-          <w:lang w:val="fr-FR"/>
-        </w:rPr>
-        <w:t>{{CONFUSIONS_LETTRES}}</w:t>
+          <w:bCs/>
+          <w:lang w:val="fr-FR"/>
+        </w:rPr>
+      </w:pPr>
+      <w:r>
+        <w:rPr>
+          <w:rFonts w:ascii="Times New Roman" w:hAnsi="Times New Roman"/>
+          <w:b/>
+          <w:bCs/>
+          <w:lang w:val="fr-FR"/>
+        </w:rPr>
+        <w:t>Conclusion : {{PHRASE_COMP_LECTURE_TEXTE}}</w:t>
+      </w:r>
+    </w:p>
+    <w:p>
+      <w:pPr>
+        <w:pStyle w:val="Standard"/>
+        <w:ind w:right="701"/>
+        <w:jc w:val="left"/>
+        <w:rPr>
+          <w:b/>
+          <w:bCs/>
+          <w:lang w:val="fr-FR"/>
+        </w:rPr>
+      </w:pPr>
+    </w:p>
+    <w:p>
+      <w:pPr>
+        <w:pStyle w:val="Standard"/>
+        <w:ind w:right="701"/>
+        <w:jc w:val="left"/>
+        <w:rPr>
+          <w:b/>
+          <w:bCs/>
+          <w:lang w:val="fr-FR"/>
+        </w:rPr>
+      </w:pPr>
+      <w:r>
+        <w:rPr>
+          <w:rFonts w:ascii="Times New Roman" w:hAnsi="Times New Roman"/>
+          <w:b/>
+          <w:bCs/>
+          <w:lang w:val="fr-FR"/>
+        </w:rPr>
+        <w:t>Orthographe</w:t>
+      </w:r>
+    </w:p>
+    <w:p>
+      <w:pPr>
+        <w:pStyle w:val="Standard"/>
+        <w:ind w:right="701"/>
+        <w:jc w:val="left"/>
+        <w:rPr>
+          <w:lang w:val="fr-FR"/>
+        </w:rPr>
+      </w:pPr>
+      <w:r>
+        <w:rPr>
+          <w:rFonts w:ascii="Times New Roman" w:hAnsi="Times New Roman"/>
+          <w:lang w:val="fr-FR"/>
+        </w:rPr>
+        <w:t>{{PRENOM_PATIENT}}</w:t>
+      </w:r>
+      <w:r>
+        <w:rPr>
+          <w:rFonts w:ascii="Times New Roman" w:hAnsi="Times New Roman"/>
+          <w:lang w:val="fr-FR"/>
+        </w:rPr>
+        <w:t xml:space="preserve"> peut écrire des lettres : score </w:t>
+      </w:r>
+      <w:r>
+        <w:rPr>
+          <w:rFonts w:ascii="Times New Roman" w:hAnsi="Times New Roman"/>
+          <w:lang w:val="fr-FR"/>
+        </w:rPr>
+        <w:t>{{SCORE_ORTHO_LETTRES}}</w:t>
+      </w:r>
+      <w:r>
+        <w:rPr>
+          <w:rFonts w:ascii="Times New Roman" w:hAnsi="Times New Roman"/>
+          <w:lang w:val="fr-FR"/>
+        </w:rPr>
+        <w:t xml:space="preserve">, sauf </w:t>
+      </w:r>
+      <w:r>
+        <w:rPr>
+          <w:rFonts w:ascii="Times New Roman" w:hAnsi="Times New Roman"/>
+          <w:lang w:val="fr-FR"/>
+        </w:rPr>
+        <w:t>{{CONFUSIONS_ORTHO_LETTRES}}.</w:t>
+      </w:r>
+    </w:p>
+    <w:p>
+      <w:pPr>
+        <w:pStyle w:val="Standard"/>
+        <w:ind w:right="701"/>
+        <w:jc w:val="left"/>
+        <w:rPr>
+          <w:rFonts w:ascii="Times New Roman" w:hAnsi="Times New Roman"/>
+          <w:lang w:val="fr-FR"/>
+        </w:rPr>
+      </w:pPr>
+      <w:r>
+        <w:rPr>
+          <w:rFonts w:ascii="Times New Roman" w:hAnsi="Times New Roman"/>
+          <w:lang w:val="fr-FR"/>
+        </w:rPr>
+        <w:t>{{PRONOM_SUJET_MAJ}}</w:t>
+      </w:r>
+      <w:r>
+        <w:rPr>
+          <w:rFonts w:ascii="Times New Roman" w:hAnsi="Times New Roman"/>
+          <w:lang w:val="fr-FR"/>
+        </w:rPr>
+        <w:t xml:space="preserve"> écrit les syllabes : </w:t>
+      </w:r>
+      <w:r>
+        <w:rPr>
+          <w:rFonts w:ascii="Times New Roman" w:hAnsi="Times New Roman"/>
+          <w:lang w:val="fr-FR"/>
+        </w:rPr>
+        <w:t>{{PRONOM_SUJET}}</w:t>
+      </w:r>
+      <w:r>
+        <w:rPr>
+          <w:rFonts w:ascii="Times New Roman" w:hAnsi="Times New Roman"/>
+          <w:lang w:val="fr-FR"/>
+        </w:rPr>
+        <w:t xml:space="preserve"> réussit </w:t>
+      </w:r>
+      <w:r>
+        <w:rPr>
+          <w:rFonts w:ascii="Times New Roman" w:hAnsi="Times New Roman"/>
+          <w:lang w:val="fr-FR"/>
+        </w:rPr>
+        <w:t>{{SCORE_ORTHO_SYLLABES}}. Exemples d'erreurs : {{ERREURS_ORTHO_SYLLABES}}.</w:t>
+      </w:r>
+    </w:p>
+    <w:p>
+      <w:pPr>
+        <w:pStyle w:val="Standard"/>
+        <w:ind w:right="701"/>
+        <w:jc w:val="left"/>
+        <w:rPr>
+          <w:lang w:val="fr-FR"/>
+        </w:rPr>
+      </w:pPr>
+      <w:r>
+        <w:rPr>
+          <w:rFonts w:ascii="Times New Roman" w:hAnsi="Times New Roman"/>
+          <w:lang w:val="fr-FR"/>
+        </w:rPr>
+        <w:t xml:space="preserve">Confusions avec les sons </w:t>
+      </w:r>
+      <w:r>
+        <w:rPr>
+          <w:rFonts w:ascii="Times New Roman" w:hAnsi="Times New Roman"/>
+          <w:lang w:val="fr-FR"/>
+        </w:rPr>
+        <w:t>{{CONFUSIONS_SONS_</w:t>
+      </w:r>
+      <w:proofErr w:type="gramStart"/>
+      <w:r>
+        <w:rPr>
+          <w:rFonts w:ascii="Times New Roman" w:hAnsi="Times New Roman"/>
+          <w:lang w:val="fr-FR"/>
+        </w:rPr>
+        <w:t>ORTHO}}.</w:t>
       </w:r>
       <w:r>
         <w:rPr>
@@ -1896,286 +2742,25 @@
         </w:rPr>
         <w:t>.</w:t>
       </w:r>
-    </w:p>
-    <w:p>
-      <w:pPr>
-        <w:pStyle w:val="Standard"/>
-        <w:ind w:right="701"/>
-        <w:jc w:val="left"/>
-        <w:rPr>
-          <w:lang w:val="fr-FR"/>
-        </w:rPr>
-      </w:pPr>
-      <w:r>
-        <w:rPr>
-          <w:rFonts w:ascii="Times New Roman" w:hAnsi="Times New Roman"/>
-          <w:lang w:val="fr-FR"/>
-        </w:rPr>
-        <w:t xml:space="preserve">Lecture de syllabes : score </w:t>
-      </w:r>
-      <w:r>
-        <w:rPr>
-          <w:rFonts w:ascii="Times New Roman" w:hAnsi="Times New Roman"/>
-          <w:lang w:val="fr-FR"/>
-        </w:rPr>
-        <w:t>{{SCORE_LECTURE_SYLLABES}}</w:t>
-      </w:r>
-    </w:p>
-    <w:p>
-      <w:pPr>
-        <w:pStyle w:val="Standard"/>
-        <w:ind w:right="701"/>
-        <w:jc w:val="left"/>
-        <w:rPr>
-          <w:lang w:val="fr-FR"/>
-        </w:rPr>
-      </w:pPr>
-      <w:r>
-        <w:rPr>
-          <w:rFonts w:ascii="Times New Roman" w:hAnsi="Times New Roman"/>
-          <w:lang w:val="fr-FR"/>
-        </w:rPr>
-        <w:t xml:space="preserve">Lecture de mots : score </w:t>
-      </w:r>
-      <w:r>
-        <w:rPr>
-          <w:rFonts w:ascii="Times New Roman" w:hAnsi="Times New Roman"/>
-          <w:lang w:val="fr-FR"/>
-        </w:rPr>
-        <w:t>{{SCORE_LECTURE_MOTS}}</w:t>
-      </w:r>
-    </w:p>
-    <w:p>
-      <w:pPr>
-        <w:pStyle w:val="Standard"/>
-        <w:ind w:right="701"/>
-        <w:jc w:val="left"/>
-        <w:rPr>
-          <w:lang w:val="fr-FR"/>
-        </w:rPr>
-      </w:pPr>
-      <w:r>
-        <w:rPr>
-          <w:rFonts w:ascii="Times New Roman" w:hAnsi="Times New Roman"/>
-          <w:lang w:val="fr-FR"/>
-        </w:rPr>
-        <w:t xml:space="preserve">Lecture de digraphes : score </w:t>
-      </w:r>
-      <w:r>
-        <w:rPr>
-          <w:rFonts w:ascii="Times New Roman" w:hAnsi="Times New Roman"/>
-          <w:lang w:val="fr-FR"/>
-        </w:rPr>
-        <w:t>{{SCORE_LECTURE_DIGRAPHES}}</w:t>
-      </w:r>
-      <w:r>
-        <w:rPr>
-          <w:rFonts w:ascii="Times New Roman" w:hAnsi="Times New Roman"/>
-          <w:lang w:val="fr-FR"/>
-        </w:rPr>
-        <w:t xml:space="preserve">, sauf </w:t>
-      </w:r>
-      <w:r>
-        <w:rPr>
-          <w:rFonts w:ascii="Times New Roman" w:hAnsi="Times New Roman"/>
-          <w:lang w:val="fr-FR"/>
-        </w:rPr>
-        <w:t>{{ERREURS_DIGRAPHES}})</w:t>
-      </w:r>
-    </w:p>
-    <w:p>
-      <w:pPr>
-        <w:pStyle w:val="Standard"/>
-        <w:ind w:right="701"/>
-        <w:jc w:val="left"/>
-        <w:rPr>
-          <w:lang w:val="fr-FR"/>
-        </w:rPr>
-      </w:pPr>
-      <w:r>
-        <w:rPr>
-          <w:rFonts w:ascii="Times New Roman" w:hAnsi="Times New Roman"/>
-          <w:lang w:val="fr-FR"/>
-        </w:rPr>
-        <w:t xml:space="preserve">Lecture de trigraphes : score </w:t>
-      </w:r>
-      <w:r>
-        <w:rPr>
-          <w:rFonts w:ascii="Times New Roman" w:hAnsi="Times New Roman"/>
-          <w:lang w:val="fr-FR"/>
-        </w:rPr>
-        <w:t>{{SCORE_LECTURE_TRIGRAPHES}}</w:t>
-      </w:r>
-      <w:r>
-        <w:rPr>
-          <w:rFonts w:ascii="Times New Roman" w:hAnsi="Times New Roman"/>
-          <w:lang w:val="fr-FR"/>
-        </w:rPr>
-        <w:t xml:space="preserve">, sauf </w:t>
-      </w:r>
-      <w:r>
-        <w:rPr>
-          <w:rFonts w:ascii="Times New Roman" w:hAnsi="Times New Roman"/>
-          <w:lang w:val="fr-FR"/>
-        </w:rPr>
-        <w:t>{{ERREURS_TRIGRAPHES}}</w:t>
-      </w:r>
-    </w:p>
-    <w:p>
-      <w:pPr>
-        <w:pStyle w:val="Standard"/>
-        <w:ind w:right="701"/>
-        <w:jc w:val="left"/>
-        <w:rPr>
-          <w:rFonts w:ascii="Times New Roman" w:hAnsi="Times New Roman"/>
-          <w:lang w:val="fr-FR"/>
-        </w:rPr>
-      </w:pPr>
-      <w:r>
-        <w:rPr>
-          <w:rFonts w:ascii="Times New Roman" w:hAnsi="Times New Roman"/>
-          <w:lang w:val="fr-FR"/>
-        </w:rPr>
-        <w:t xml:space="preserve">Lecture de phrases : score </w:t>
-      </w:r>
-      <w:r>
-        <w:rPr>
-          <w:rFonts w:ascii="Times New Roman" w:hAnsi="Times New Roman"/>
-          <w:lang w:val="fr-FR"/>
-        </w:rPr>
-        <w:t>{{SCORE_LECTURE_PHRASES}}</w:t>
-      </w:r>
-      <w:r>
-        <w:rPr>
-          <w:rFonts w:ascii="Times New Roman" w:hAnsi="Times New Roman"/>
-          <w:lang w:val="fr-FR"/>
-        </w:rPr>
-        <w:t xml:space="preserve">, </w:t>
-      </w:r>
-      <w:r>
-        <w:rPr>
-          <w:rFonts w:ascii="Times New Roman" w:hAnsi="Times New Roman"/>
-          <w:lang w:val="fr-FR"/>
-        </w:rPr>
-        <w:t>{{ERREURS_LECTURE_PHRASES}})</w:t>
-      </w:r>
-    </w:p>
-    <w:p>
-      <w:pPr>
-        <w:pStyle w:val="Standard"/>
-        <w:ind w:right="701"/>
-        <w:jc w:val="left"/>
-        <w:rPr>
-          <w:lang w:val="fr-FR"/>
-        </w:rPr>
-      </w:pPr>
-    </w:p>
-    <w:p>
-      <w:pPr>
-        <w:pStyle w:val="Standard"/>
-        <w:ind w:right="701"/>
-        <w:jc w:val="left"/>
-        <w:rPr>
-          <w:lang w:val="fr-FR"/>
-        </w:rPr>
-      </w:pPr>
-      <w:r>
-        <w:rPr>
-          <w:rFonts w:ascii="Times New Roman" w:hAnsi="Times New Roman"/>
-          <w:lang w:val="fr-FR"/>
-        </w:rPr>
-        <w:t xml:space="preserve">Score total : </w:t>
-      </w:r>
-      <w:r>
-        <w:rPr>
-          <w:rFonts w:ascii="Times New Roman" w:hAnsi="Times New Roman"/>
-          <w:b/>
-          <w:bCs/>
-          <w:lang w:val="fr-FR"/>
-        </w:rPr>
-        <w:t xml:space="preserve">score </w:t>
-      </w:r>
-      <w:r>
-        <w:rPr>
-          <w:rFonts w:ascii="Times New Roman" w:hAnsi="Times New Roman"/>
-          <w:b/>
-          <w:bCs/>
-          <w:lang w:val="fr-FR"/>
-        </w:rPr>
-        <w:t>{{SCORE_TOTAL_LECTURE}}</w:t>
-      </w:r>
-      <w:r>
-        <w:rPr>
-          <w:rFonts w:ascii="Times New Roman" w:hAnsi="Times New Roman"/>
-          <w:b/>
-          <w:bCs/>
-          <w:lang w:val="fr-FR"/>
-        </w:rPr>
-        <w:t xml:space="preserve">, </w:t>
-      </w:r>
-      <w:r>
-        <w:rPr>
-          <w:rFonts w:ascii="Times New Roman" w:hAnsi="Times New Roman"/>
-          <w:b/>
-          <w:bCs/>
-          <w:lang w:val="fr-FR"/>
-        </w:rPr>
-        <w:t>score à {{ECART_TOTAL_LECTURE}} des {{CLASSE_SCOLAIRE}}</w:t>
-      </w:r>
-      <w:r>
-        <w:rPr>
-          <w:rFonts w:ascii="Times New Roman" w:hAnsi="Times New Roman"/>
-          <w:b/>
-          <w:bCs/>
-          <w:lang w:val="fr-FR"/>
-        </w:rPr>
-        <w:t>.</w:t>
-      </w:r>
-    </w:p>
-    <w:p>
-      <w:pPr>
-        <w:pStyle w:val="Standard"/>
-        <w:ind w:right="701"/>
-        <w:jc w:val="left"/>
-        <w:rPr>
-          <w:b/>
-          <w:bCs/>
-          <w:lang w:val="fr-FR"/>
-        </w:rPr>
-      </w:pPr>
-    </w:p>
-    <w:p>
-      <w:pPr>
-        <w:pStyle w:val="Standard"/>
-        <w:ind w:right="701"/>
-        <w:jc w:val="left"/>
-        <w:rPr>
-          <w:lang w:val="fr-FR"/>
-        </w:rPr>
-      </w:pPr>
-      <w:r>
-        <w:rPr>
-          <w:rFonts w:ascii="Times New Roman" w:hAnsi="Times New Roman"/>
-          <w:b/>
-          <w:bCs/>
-          <w:lang w:val="fr-FR"/>
-        </w:rPr>
-        <w:t>Lecture d'un paragraphe </w:t>
-      </w:r>
-      <w:r>
-        <w:rPr>
-          <w:rFonts w:ascii="Times New Roman" w:hAnsi="Times New Roman"/>
-          <w:lang w:val="fr-FR"/>
-        </w:rPr>
-        <w:t>: le magicien des couleurs</w:t>
-      </w:r>
-    </w:p>
-    <w:p>
-      <w:pPr>
-        <w:pStyle w:val="Standard"/>
-        <w:ind w:right="701"/>
-        <w:jc w:val="left"/>
-        <w:rPr>
+      <w:proofErr w:type="gramEnd"/>
+    </w:p>
+    <w:p>
+      <w:pPr>
+        <w:pStyle w:val="Standard"/>
+        <w:ind w:right="701"/>
+        <w:jc w:val="left"/>
+        <w:rPr>
+          <w:lang w:val="fr-FR"/>
+        </w:rPr>
+      </w:pPr>
+    </w:p>
+    <w:p>
+      <w:pPr>
+        <w:pStyle w:val="Standard"/>
+        <w:ind w:right="701"/>
+        <w:jc w:val="left"/>
+        <w:rPr>
+          <w:rFonts w:ascii="Times New Roman" w:hAnsi="Times New Roman"/>
           <w:lang w:val="fr-FR"/>
         </w:rPr>
       </w:pPr>
@@ -2191,380 +2776,21 @@
           <w:rFonts w:ascii="Times New Roman" w:hAnsi="Times New Roman"/>
           <w:lang w:val="fr-FR"/>
         </w:rPr>
-        <w:t xml:space="preserve"> peut lire des phrases </w:t>
-      </w:r>
-      <w:r>
-        <w:rPr>
-          <w:rFonts w:ascii="Times New Roman" w:hAnsi="Times New Roman"/>
-          <w:lang w:val="fr-FR"/>
-        </w:rPr>
-        <w:t>{{OBSERVATION_LECTURE_TEXTE}}</w:t>
-      </w:r>
-      <w:r>
-        <w:rPr>
-          <w:rFonts w:ascii="Times New Roman" w:hAnsi="Times New Roman"/>
-          <w:lang w:val="fr-FR"/>
-        </w:rPr>
-        <w:t>.</w:t>
-      </w:r>
-    </w:p>
-    <w:p>
-      <w:pPr>
-        <w:pStyle w:val="Standard"/>
-        <w:ind w:right="701"/>
-        <w:jc w:val="left"/>
-        <w:rPr>
-          <w:rFonts w:ascii="Times New Roman" w:hAnsi="Times New Roman"/>
-          <w:lang w:val="fr-FR"/>
-        </w:rPr>
-      </w:pPr>
-      <w:r>
-        <w:rPr>
-          <w:rFonts w:ascii="Times New Roman" w:hAnsi="Times New Roman"/>
-          <w:lang w:val="fr-FR"/>
-        </w:rPr>
-        <w:t xml:space="preserve">Il lit avec une qualité de lecture à </w:t>
-      </w:r>
-      <w:r>
-        <w:rPr>
-          <w:rFonts w:ascii="Times New Roman" w:hAnsi="Times New Roman"/>
-          <w:lang w:val="fr-FR"/>
-        </w:rPr>
-        <w:t>{{ECART_QUALITE_LECTURE}} des {{CLASSE_SCOLAIRE}}</w:t>
-      </w:r>
-      <w:r>
-        <w:rPr>
-          <w:rFonts w:ascii="Times New Roman" w:hAnsi="Times New Roman"/>
-          <w:lang w:val="fr-FR"/>
-        </w:rPr>
-        <w:t> :</w:t>
-      </w:r>
-    </w:p>
-    <w:p>
-      <w:pPr>
-        <w:pStyle w:val="Standard"/>
-        <w:ind w:right="701"/>
-        <w:jc w:val="left"/>
-        <w:rPr>
-          <w:lang w:val="fr-FR"/>
-        </w:rPr>
-      </w:pPr>
-      <w:proofErr w:type="gramStart"/>
-      <w:r>
-        <w:rPr>
-          <w:rFonts w:ascii="Times New Roman" w:hAnsi="Times New Roman"/>
-          <w:lang w:val="fr-FR"/>
-        </w:rPr>
-        <w:t>il</w:t>
-      </w:r>
-      <w:proofErr w:type="gramEnd"/>
-      <w:r>
-        <w:rPr>
-          <w:rFonts w:ascii="Times New Roman" w:hAnsi="Times New Roman"/>
-          <w:lang w:val="fr-FR"/>
-        </w:rPr>
-        <w:t xml:space="preserve"> a bien lu </w:t>
-      </w:r>
-      <w:r>
-        <w:rPr>
-          <w:rFonts w:ascii="Times New Roman" w:hAnsi="Times New Roman"/>
-          <w:lang w:val="fr-FR"/>
-        </w:rPr>
-        <w:t>{{MOTS_LUS_CORRECTEMENT</w:t>
-      </w:r>
-      <w:proofErr w:type="gramStart"/>
-      <w:r>
-        <w:rPr>
-          <w:rFonts w:ascii="Times New Roman" w:hAnsi="Times New Roman"/>
-          <w:lang w:val="fr-FR"/>
-        </w:rPr>
-        <w:t>}}</w:t>
-      </w:r>
-      <w:r>
-        <w:rPr>
-          <w:rFonts w:ascii="Times New Roman" w:hAnsi="Times New Roman"/>
-          <w:lang w:val="fr-FR"/>
-        </w:rPr>
-        <w:t>mots</w:t>
-      </w:r>
-      <w:proofErr w:type="gramEnd"/>
-      <w:r>
-        <w:rPr>
-          <w:rFonts w:ascii="Times New Roman" w:hAnsi="Times New Roman"/>
-          <w:lang w:val="fr-FR"/>
-        </w:rPr>
-        <w:t>.</w:t>
-      </w:r>
-    </w:p>
-    <w:p>
-      <w:pPr>
-        <w:pStyle w:val="Standard"/>
-        <w:ind w:right="701"/>
-        <w:jc w:val="left"/>
-        <w:rPr>
-          <w:lang w:val="fr-FR"/>
-        </w:rPr>
-      </w:pPr>
-      <w:r>
-        <w:rPr>
-          <w:rFonts w:ascii="Times New Roman" w:hAnsi="Times New Roman"/>
-          <w:lang w:val="fr-FR"/>
-        </w:rPr>
-        <w:t xml:space="preserve">Il lit avec une vitesse de </w:t>
-      </w:r>
-      <w:r>
-        <w:rPr>
-          <w:rFonts w:ascii="Times New Roman" w:hAnsi="Times New Roman"/>
-          <w:lang w:val="fr-FR"/>
-        </w:rPr>
-        <w:t>{{ECART_VITESSE_LECTURE}} des {{CLASSE_</w:t>
-      </w:r>
-      <w:proofErr w:type="gramStart"/>
-      <w:r>
-        <w:rPr>
-          <w:rFonts w:ascii="Times New Roman" w:hAnsi="Times New Roman"/>
-          <w:lang w:val="fr-FR"/>
-        </w:rPr>
-        <w:t>SCOLAIRE}}.</w:t>
-      </w:r>
-      <w:r>
-        <w:rPr>
-          <w:rFonts w:ascii="Times New Roman" w:hAnsi="Times New Roman"/>
-          <w:lang w:val="fr-FR"/>
-        </w:rPr>
-        <w:t>.</w:t>
-      </w:r>
-      <w:proofErr w:type="gramEnd"/>
-    </w:p>
-    <w:p>
-      <w:pPr>
-        <w:pStyle w:val="Standard"/>
-        <w:ind w:right="701"/>
-        <w:jc w:val="left"/>
-        <w:rPr>
-          <w:b/>
-          <w:bCs/>
-          <w:lang w:val="fr-FR"/>
-        </w:rPr>
-      </w:pPr>
-      <w:r>
-        <w:rPr>
-          <w:rFonts w:ascii="Times New Roman" w:hAnsi="Times New Roman"/>
-          <w:b/>
-          <w:bCs/>
-          <w:lang w:val="fr-FR"/>
-        </w:rPr>
-        <w:t xml:space="preserve">Il comprend le paragraphe avec un score </w:t>
-      </w:r>
-      <w:r>
-        <w:rPr>
-          <w:rFonts w:ascii="Times New Roman" w:hAnsi="Times New Roman"/>
-          <w:b/>
-          <w:bCs/>
-          <w:lang w:val="fr-FR"/>
-        </w:rPr>
-        <w:t>{{SCORE_COMP_LECTURE_TEXTE}}, score à {{ECART_COMP_LECTURE_TEXTE}} des {{CLASSE_SCOLAIRE}}.</w:t>
-      </w:r>
-    </w:p>
-    <w:p>
-      <w:pPr>
-        <w:pStyle w:val="Standard"/>
-        <w:ind w:right="701"/>
-        <w:jc w:val="left"/>
-        <w:rPr>
-          <w:rFonts w:ascii="Times New Roman" w:hAnsi="Times New Roman"/>
-          <w:b/>
-          <w:bCs/>
-          <w:lang w:val="fr-FR"/>
-        </w:rPr>
-      </w:pPr>
-      <w:r>
-        <w:rPr>
-          <w:rFonts w:ascii="Times New Roman" w:hAnsi="Times New Roman"/>
-          <w:b/>
-          <w:bCs/>
-          <w:lang w:val="fr-FR"/>
-        </w:rPr>
-        <w:lastRenderedPageBreak/>
-        <w:t>Conclusion : {{PHRASE_COMP_LECTURE_TEXTE}}</w:t>
-      </w:r>
-    </w:p>
-    <w:p>
-      <w:pPr>
-        <w:pStyle w:val="Standard"/>
-        <w:ind w:right="701"/>
-        <w:jc w:val="left"/>
-        <w:rPr>
-          <w:b/>
-          <w:bCs/>
-          <w:lang w:val="fr-FR"/>
-        </w:rPr>
-      </w:pPr>
-    </w:p>
-    <w:p>
-      <w:pPr>
-        <w:pStyle w:val="Standard"/>
-        <w:ind w:right="701"/>
-        <w:jc w:val="left"/>
-        <w:rPr>
-          <w:b/>
-          <w:bCs/>
-          <w:lang w:val="fr-FR"/>
-        </w:rPr>
-      </w:pPr>
-      <w:r>
-        <w:rPr>
-          <w:rFonts w:ascii="Times New Roman" w:hAnsi="Times New Roman"/>
-          <w:b/>
-          <w:bCs/>
-          <w:lang w:val="fr-FR"/>
-        </w:rPr>
-        <w:t>Orthographe</w:t>
-      </w:r>
-    </w:p>
-    <w:p>
-      <w:pPr>
-        <w:pStyle w:val="Standard"/>
-        <w:ind w:right="701"/>
-        <w:jc w:val="left"/>
-        <w:rPr>
-          <w:lang w:val="fr-FR"/>
-        </w:rPr>
-      </w:pPr>
-      <w:r>
-        <w:rPr>
-          <w:rFonts w:ascii="Times New Roman" w:hAnsi="Times New Roman"/>
-          <w:lang w:val="fr-FR"/>
-        </w:rPr>
-        <w:t>{{PRENOM_PATIENT}}</w:t>
-      </w:r>
-      <w:r>
-        <w:rPr>
-          <w:rFonts w:ascii="Times New Roman" w:hAnsi="Times New Roman"/>
-          <w:lang w:val="fr-FR"/>
-        </w:rPr>
-        <w:t xml:space="preserve"> peut écrire des lettres : score </w:t>
-      </w:r>
-      <w:r>
-        <w:rPr>
-          <w:rFonts w:ascii="Times New Roman" w:hAnsi="Times New Roman"/>
-          <w:lang w:val="fr-FR"/>
-        </w:rPr>
-        <w:t>{{SCORE_ORTHO_LETTRES}}</w:t>
-      </w:r>
-      <w:r>
-        <w:rPr>
-          <w:rFonts w:ascii="Times New Roman" w:hAnsi="Times New Roman"/>
-          <w:lang w:val="fr-FR"/>
-        </w:rPr>
-        <w:t xml:space="preserve">, sauf </w:t>
-      </w:r>
-      <w:r>
-        <w:rPr>
-          <w:rFonts w:ascii="Times New Roman" w:hAnsi="Times New Roman"/>
-          <w:lang w:val="fr-FR"/>
-        </w:rPr>
-        <w:t>{{CONFUSIONS_ORTHO_LETTRES}}.</w:t>
-      </w:r>
-    </w:p>
-    <w:p>
-      <w:pPr>
-        <w:pStyle w:val="Standard"/>
-        <w:ind w:right="701"/>
-        <w:jc w:val="left"/>
-        <w:rPr>
-          <w:rFonts w:ascii="Times New Roman" w:hAnsi="Times New Roman"/>
-          <w:lang w:val="fr-FR"/>
-        </w:rPr>
-      </w:pPr>
-      <w:r>
-        <w:rPr>
-          <w:rFonts w:ascii="Times New Roman" w:hAnsi="Times New Roman"/>
-          <w:lang w:val="fr-FR"/>
-        </w:rPr>
-        <w:t xml:space="preserve">Il écrit les syllabes : il réussit </w:t>
-      </w:r>
-      <w:r>
-        <w:rPr>
-          <w:rFonts w:ascii="Times New Roman" w:hAnsi="Times New Roman"/>
-          <w:lang w:val="fr-FR"/>
-        </w:rPr>
-        <w:t>{{SCORE_ORTHO_SYLLABES}}. Exemples d'erreurs : {{ERREURS_ORTHO_SYLLABES}}.</w:t>
-      </w:r>
-    </w:p>
-    <w:p>
-      <w:pPr>
-        <w:pStyle w:val="Standard"/>
-        <w:ind w:right="701"/>
-        <w:jc w:val="left"/>
-        <w:rPr>
-          <w:lang w:val="fr-FR"/>
-        </w:rPr>
-      </w:pPr>
-      <w:r>
-        <w:rPr>
-          <w:rFonts w:ascii="Times New Roman" w:hAnsi="Times New Roman"/>
-          <w:lang w:val="fr-FR"/>
-        </w:rPr>
-        <w:t xml:space="preserve">Confusions avec les sons </w:t>
-      </w:r>
-      <w:r>
-        <w:rPr>
-          <w:rFonts w:ascii="Times New Roman" w:hAnsi="Times New Roman"/>
-          <w:lang w:val="fr-FR"/>
-        </w:rPr>
-        <w:t>{{CONFUSIONS_SONS_</w:t>
-      </w:r>
-      <w:proofErr w:type="gramStart"/>
-      <w:r>
-        <w:rPr>
-          <w:rFonts w:ascii="Times New Roman" w:hAnsi="Times New Roman"/>
-          <w:lang w:val="fr-FR"/>
-        </w:rPr>
-        <w:t>ORTHO}}.</w:t>
-      </w:r>
-      <w:r>
-        <w:rPr>
-          <w:rFonts w:ascii="Times New Roman" w:hAnsi="Times New Roman"/>
-          <w:lang w:val="fr-FR"/>
-        </w:rPr>
-        <w:t>.</w:t>
-      </w:r>
-      <w:proofErr w:type="gramEnd"/>
-    </w:p>
-    <w:p>
-      <w:pPr>
-        <w:pStyle w:val="Standard"/>
-        <w:ind w:right="701"/>
-        <w:jc w:val="left"/>
-        <w:rPr>
-          <w:lang w:val="fr-FR"/>
-        </w:rPr>
-      </w:pPr>
-    </w:p>
-    <w:p>
-      <w:pPr>
-        <w:pStyle w:val="Standard"/>
-        <w:ind w:right="701"/>
-        <w:jc w:val="left"/>
-        <w:rPr>
-          <w:rFonts w:ascii="Times New Roman" w:hAnsi="Times New Roman"/>
-          <w:lang w:val="fr-FR"/>
-        </w:rPr>
-      </w:pPr>
-      <w:r>
-        <w:rPr>
-          <w:rFonts w:ascii="Times New Roman" w:hAnsi="Times New Roman"/>
-          <w:lang w:val="fr-FR"/>
-        </w:rPr>
-        <w:t>{{PRENOM_PATIENT}}</w:t>
-      </w:r>
-      <w:r>
-        <w:rPr>
-          <w:rFonts w:ascii="Times New Roman" w:hAnsi="Times New Roman"/>
-          <w:lang w:val="fr-FR"/>
-        </w:rPr>
-        <w:t xml:space="preserve"> peut écrire une phrase, mais il a tendance à coller les mots </w:t>
+        <w:t xml:space="preserve"> peut écrire une phrase, mais </w:t>
+      </w:r>
+      <w:r>
+        <w:rPr>
+          <w:rFonts w:ascii="Times New Roman" w:hAnsi="Times New Roman"/>
+          <w:lang w:val="fr-FR"/>
+        </w:rPr>
+        <w:t>{{PRONOM_SUJET}}</w:t>
+      </w:r>
+      <w:r>
+        <w:rPr>
+          <w:rFonts w:ascii="Times New Roman" w:hAnsi="Times New Roman"/>
+          <w:lang w:val="fr-FR"/>
+        </w:rPr>
+        <w:t xml:space="preserve"> a tendance à coller les mots </w:t>
       </w:r>
       <w:r>
         <w:rPr>
@@ -2723,15 +2949,13 @@
           <w:lang w:val="fr-FR"/>
         </w:rPr>
       </w:pPr>
-      <w:proofErr w:type="gramStart"/>
-      <w:r>
-        <w:rPr>
-          <w:rFonts w:ascii="Times New Roman" w:hAnsi="Times New Roman"/>
-          <w:lang w:val="fr-FR"/>
-        </w:rPr>
-        <w:t>il</w:t>
-      </w:r>
-      <w:proofErr w:type="gramEnd"/>
+      <w:r>
+        <w:rPr>
+          <w:rFonts w:ascii="Times New Roman" w:hAnsi="Times New Roman"/>
+          <w:lang w:val="fr-FR"/>
+        </w:rPr>
+        <w:t>{{PRONOM_SUJET}}</w:t>
+      </w:r>
       <w:r>
         <w:rPr>
           <w:rFonts w:ascii="Times New Roman" w:hAnsi="Times New Roman"/>
@@ -2808,14 +3032,7 @@
           <w:rFonts w:ascii="Times New Roman" w:hAnsi="Times New Roman"/>
           <w:lang w:val="fr-FR"/>
         </w:rPr>
-        <w:t>Raisonnement</w:t>
-      </w:r>
-      <w:r>
-        <w:rPr>
-          <w:rFonts w:ascii="Times New Roman" w:hAnsi="Times New Roman"/>
-          <w:lang w:val="fr-FR"/>
-        </w:rPr>
-        <w:t xml:space="preserve"> avec les problèmes : réussites </w:t>
+        <w:t xml:space="preserve">Raisonnement avec les problèmes : réussites </w:t>
       </w:r>
       <w:r>
         <w:rPr>
@@ -2829,7 +3046,21 @@
           <w:rFonts w:ascii="Times New Roman" w:hAnsi="Times New Roman"/>
           <w:lang w:val="fr-FR"/>
         </w:rPr>
-        <w:t xml:space="preserve"> ; il comprend </w:t>
+        <w:t xml:space="preserve"> ; </w:t>
+      </w:r>
+      <w:r>
+        <w:rPr>
+          <w:rFonts w:ascii="Times New Roman" w:hAnsi="Times New Roman"/>
+          <w:lang w:val="fr-FR"/>
+        </w:rPr>
+        <w:t>{{PRONOM_SUJET}}</w:t>
+      </w:r>
+      <w:r>
+        <w:rPr>
+          <w:rFonts w:ascii="Times New Roman" w:hAnsi="Times New Roman"/>
+          <w:lang w:val="fr-FR"/>
+        </w:rPr>
+        <w:t xml:space="preserve"> comprend </w:t>
       </w:r>
       <w:r>
         <w:rPr>
@@ -2997,7 +3228,23 @@
           <w:bCs/>
           <w:lang w:val="fr-FR"/>
         </w:rPr>
-        <w:t xml:space="preserve">phonologie : il </w:t>
+        <w:t xml:space="preserve">phonologie : </w:t>
+      </w:r>
+      <w:r>
+        <w:rPr>
+          <w:rFonts w:ascii="Times New Roman" w:hAnsi="Times New Roman"/>
+          <w:bCs/>
+          <w:lang w:val="fr-FR"/>
+        </w:rPr>
+        <w:t>{{PRONOM_SUJET}}</w:t>
+      </w:r>
+      <w:r>
+        <w:rPr>
+          <w:rFonts w:ascii="Times New Roman" w:hAnsi="Times New Roman"/>
+          <w:bCs/>
+          <w:lang w:val="fr-FR"/>
+        </w:rPr>
+        <w:t xml:space="preserve"> </w:t>
       </w:r>
       <w:r>
         <w:rPr>
@@ -3031,7 +3278,23 @@
           <w:bCs/>
           <w:lang w:val="fr-FR"/>
         </w:rPr>
-        <w:t xml:space="preserve">-il a un </w:t>
+        <w:t>-</w:t>
+      </w:r>
+      <w:r>
+        <w:rPr>
+          <w:rFonts w:ascii="Times New Roman" w:hAnsi="Times New Roman"/>
+          <w:bCs/>
+          <w:lang w:val="fr-FR"/>
+        </w:rPr>
+        <w:t>{{PRONOM_SUJET}}</w:t>
+      </w:r>
+      <w:r>
+        <w:rPr>
+          <w:rFonts w:ascii="Times New Roman" w:hAnsi="Times New Roman"/>
+          <w:bCs/>
+          <w:lang w:val="fr-FR"/>
+        </w:rPr>
+        <w:t xml:space="preserve"> a un </w:t>
       </w:r>
       <w:r>
         <w:rPr>
@@ -3189,6 +3452,14 @@
           <w:bCs/>
           <w:lang w:val="fr-FR"/>
         </w:rPr>
+        <w:t xml:space="preserve"> </w:t>
+      </w:r>
+      <w:r>
+        <w:rPr>
+          <w:rFonts w:ascii="Times New Roman" w:hAnsi="Times New Roman"/>
+          <w:bCs/>
+          <w:lang w:val="fr-FR"/>
+        </w:rPr>
         <w:t>{{ECART_TOTAL_</w:t>
       </w:r>
       <w:r>
@@ -3332,16 +3603,6 @@
         </w:rPr>
         <w:t>.</w:t>
       </w:r>
-    </w:p>
-    <w:p>
-      <w:pPr>
-        <w:pStyle w:val="Standard"/>
-        <w:ind w:right="701"/>
-        <w:jc w:val="left"/>
-        <w:rPr>
-          <w:lang w:val="fr-FR"/>
-        </w:rPr>
-      </w:pPr>
     </w:p>
     <w:sectPr>
       <w:pgSz w:w="11906" w:h="16838"/>
@@ -4150,6 +4411,7 @@
   <w:style w:type="character" w:default="1" w:styleId="Policepardfaut">
     <w:name w:val="Default Paragraph Font"/>
     <w:uiPriority w:val="1"/>
+    <w:semiHidden/>
     <w:unhideWhenUsed/>
   </w:style>
   <w:style w:type="table" w:default="1" w:styleId="TableauNormal">
@@ -4304,7 +4566,7 @@
     <w:basedOn w:val="Aucuneliste"/>
     <w:pPr>
       <w:numPr>
-        <w:numId w:val="3"/>
+        <w:numId w:val="4"/>
       </w:numPr>
     </w:pPr>
   </w:style>

</xml_diff>

<commit_message>
Update orthophonie report workflow
</commit_message>
<xml_diff>
--- a/Test_PlaceHolder.docx
+++ b/Test_PlaceHolder.docx
@@ -346,7 +346,15 @@
                 <w:sz w:val="22"/>
                 <w:lang w:val="fr-FR"/>
               </w:rPr>
-              <w:t>Créteil, le 22/07/21</w:t>
+              <w:t xml:space="preserve">Créteil, le </w:t>
+            </w:r>
+            <w:r>
+              <w:rPr>
+                <w:rFonts w:ascii="Times New Roman" w:hAnsi="Times New Roman"/>
+                <w:sz w:val="22"/>
+                <w:lang w:val="fr-FR"/>
+              </w:rPr>
+              <w:t>26 février 2026</w:t>
             </w:r>
           </w:p>
           <w:p>
@@ -582,22 +590,44 @@
           <w:lang w:val="fr-FR"/>
         </w:rPr>
       </w:pPr>
-      <w:proofErr w:type="gramStart"/>
-      <w:r>
+      <w:r>
+        <w:t>de {{PRENOM_PATIENT}} {{NOM_PATIENT}}</w:t>
+      </w:r>
+    </w:p>
+    <w:p>
+      <w:pPr>
+        <w:pStyle w:val="Standard"/>
+        <w:ind w:right="701"/>
+        <w:jc w:val="center"/>
         <w:rPr>
           <w:rFonts w:ascii="Times New Roman" w:hAnsi="Times New Roman"/>
           <w:b/>
           <w:u w:val="single"/>
           <w:lang w:val="fr-FR"/>
         </w:rPr>
-        <w:t>de</w:t>
-      </w:r>
-      <w:proofErr w:type="gramEnd"/>
-      <w:r>
-        <w:rPr>
-          <w:rFonts w:ascii="Times New Roman" w:hAnsi="Times New Roman"/>
-          <w:b/>
-          <w:u w:val="single"/>
+      </w:pPr>
+    </w:p>
+    <w:p>
+      <w:pPr>
+        <w:pStyle w:val="Standard"/>
+        <w:ind w:right="701"/>
+        <w:jc w:val="left"/>
+        <w:rPr>
+          <w:lang w:val="fr-FR"/>
+        </w:rPr>
+      </w:pPr>
+      <w:r>
+        <w:rPr>
+          <w:rFonts w:ascii="Times New Roman" w:hAnsi="Times New Roman"/>
+          <w:sz w:val="22"/>
+          <w:lang w:val="fr-FR"/>
+        </w:rPr>
+        <w:t>{{PRENOM_PATIENT}}</w:t>
+      </w:r>
+      <w:r>
+        <w:rPr>
+          <w:rFonts w:ascii="Times New Roman" w:hAnsi="Times New Roman"/>
+          <w:sz w:val="22"/>
           <w:lang w:val="fr-FR"/>
         </w:rPr>
         <w:t xml:space="preserve"> </w:t>
@@ -608,74 +638,7 @@
           <w:sz w:val="22"/>
           <w:lang w:val="fr-FR"/>
         </w:rPr>
-        <w:t>{{PRENOM_PATIENT</w:t>
-      </w:r>
-      <w:proofErr w:type="gramStart"/>
-      <w:r>
-        <w:rPr>
-          <w:rFonts w:ascii="Times New Roman" w:hAnsi="Times New Roman"/>
-          <w:sz w:val="22"/>
-          <w:lang w:val="fr-FR"/>
-        </w:rPr>
-        <w:t>}}{</w:t>
-      </w:r>
-      <w:proofErr w:type="gramEnd"/>
-      <w:r>
-        <w:rPr>
-          <w:rFonts w:ascii="Times New Roman" w:hAnsi="Times New Roman"/>
-          <w:sz w:val="22"/>
-          <w:lang w:val="fr-FR"/>
-        </w:rPr>
-        <w:t>{NOM_PATIENT}}</w:t>
-      </w:r>
-    </w:p>
-    <w:p>
-      <w:pPr>
-        <w:pStyle w:val="Standard"/>
-        <w:ind w:right="701"/>
-        <w:jc w:val="center"/>
-        <w:rPr>
-          <w:rFonts w:ascii="Times New Roman" w:hAnsi="Times New Roman"/>
-          <w:b/>
-          <w:u w:val="single"/>
-          <w:lang w:val="fr-FR"/>
-        </w:rPr>
-      </w:pPr>
-    </w:p>
-    <w:p>
-      <w:pPr>
-        <w:pStyle w:val="Standard"/>
-        <w:ind w:right="701"/>
-        <w:jc w:val="left"/>
-        <w:rPr>
-          <w:lang w:val="fr-FR"/>
-        </w:rPr>
-      </w:pPr>
-      <w:r>
-        <w:rPr>
-          <w:rFonts w:ascii="Times New Roman" w:hAnsi="Times New Roman"/>
-          <w:sz w:val="22"/>
-          <w:lang w:val="fr-FR"/>
-        </w:rPr>
-        <w:t>{{PRENOM_PATIENT</w:t>
-      </w:r>
-      <w:proofErr w:type="gramStart"/>
-      <w:r>
-        <w:rPr>
-          <w:rFonts w:ascii="Times New Roman" w:hAnsi="Times New Roman"/>
-          <w:sz w:val="22"/>
-          <w:lang w:val="fr-FR"/>
-        </w:rPr>
-        <w:t>}}{</w:t>
-      </w:r>
-      <w:proofErr w:type="gramEnd"/>
-      <w:r>
-        <w:rPr>
-          <w:rFonts w:ascii="Times New Roman" w:hAnsi="Times New Roman"/>
-          <w:sz w:val="22"/>
-          <w:lang w:val="fr-FR"/>
-        </w:rPr>
-        <w:t>{NOM_PATIENT}}</w:t>
+        <w:t>{{NOM_PATIENT}}</w:t>
       </w:r>
       <w:r>
         <w:rPr>
@@ -1583,14 +1546,7 @@
           <w:rFonts w:ascii="Times New Roman" w:hAnsi="Times New Roman"/>
           <w:lang w:val="fr-FR"/>
         </w:rPr>
-        <w:t xml:space="preserve">Il </w:t>
-      </w:r>
-      <w:r>
-        <w:rPr>
-          <w:rFonts w:ascii="Times New Roman" w:hAnsi="Times New Roman"/>
-          <w:lang w:val="fr-FR"/>
-        </w:rPr>
-        <w:t xml:space="preserve">faut montrer des images : </w:t>
+        <w:t xml:space="preserve">Il faut montrer des images : </w:t>
       </w:r>
       <w:r>
         <w:rPr>

</xml_diff>

<commit_message>
Prepare turnkey orthophonie app setup
</commit_message>
<xml_diff>
--- a/Test_PlaceHolder.docx
+++ b/Test_PlaceHolder.docx
@@ -162,23 +162,13 @@
                 <w:lang w:val="fr-FR"/>
               </w:rPr>
             </w:pPr>
-            <w:proofErr w:type="gramStart"/>
             <w:r>
               <w:rPr>
                 <w:rFonts w:ascii="Times New Roman" w:hAnsi="Times New Roman"/>
                 <w:sz w:val="16"/>
                 <w:lang w:val="fr-FR"/>
               </w:rPr>
-              <w:t>du</w:t>
-            </w:r>
-            <w:proofErr w:type="gramEnd"/>
-            <w:r>
-              <w:rPr>
-                <w:rFonts w:ascii="Times New Roman" w:hAnsi="Times New Roman"/>
-                <w:sz w:val="16"/>
-                <w:lang w:val="fr-FR"/>
-              </w:rPr>
-              <w:t xml:space="preserve"> calcul, du langage oral et écrit ;</w:t>
+              <w:t>du calcul, du langage oral et écrit ;</w:t>
             </w:r>
           </w:p>
           <w:p>
@@ -266,7 +256,6 @@
               <w:jc w:val="center"/>
             </w:pPr>
             <w:proofErr w:type="spellStart"/>
-            <w:proofErr w:type="gramStart"/>
             <w:r>
               <w:rPr>
                 <w:rFonts w:ascii="Times New Roman" w:hAnsi="Times New Roman"/>
@@ -280,15 +269,7 @@
                 <w:rFonts w:ascii="Times New Roman" w:hAnsi="Times New Roman"/>
                 <w:sz w:val="20"/>
               </w:rPr>
-              <w:t xml:space="preserve"> :</w:t>
-            </w:r>
-            <w:proofErr w:type="gramEnd"/>
-            <w:r>
-              <w:rPr>
-                <w:rFonts w:ascii="Times New Roman" w:hAnsi="Times New Roman"/>
-                <w:sz w:val="20"/>
-              </w:rPr>
-              <w:t xml:space="preserve"> 01.48.98.15.76</w:t>
+              <w:t xml:space="preserve"> : 01.48.98.15.76</w:t>
             </w:r>
           </w:p>
         </w:tc>
@@ -591,6 +572,9 @@
         </w:rPr>
       </w:pPr>
       <w:r>
+        <w:rPr>
+          <w:lang w:val="fr-FR"/>
+        </w:rPr>
         <w:t>de {{PRENOM_PATIENT}} {{NOM_PATIENT}}</w:t>
       </w:r>
     </w:p>
@@ -866,6 +850,28 @@
         </w:rPr>
         <w:t xml:space="preserve"> à la maison</w:t>
       </w:r>
+      <w:r>
+        <w:rPr>
+          <w:rFonts w:ascii="Times New Roman" w:hAnsi="Times New Roman"/>
+          <w:bCs/>
+          <w:lang w:val="fr-FR"/>
+        </w:rPr>
+        <w:t>.</w:t>
+      </w:r>
+      <w:r>
+        <w:rPr>
+          <w:rFonts w:ascii="Times New Roman" w:hAnsi="Times New Roman"/>
+          <w:bCs/>
+          <w:lang w:val="fr-FR"/>
+        </w:rPr>
+        <w:br/>
+      </w:r>
+      <w:r>
+        <w:rPr>
+          <w:lang w:val="fr-FR"/>
+        </w:rPr>
+        <w:t>{{PARCOURS_SCOLAIRE}}</w:t>
+      </w:r>
     </w:p>
     <w:p>
       <w:pPr>
@@ -1152,15 +1158,13 @@
         </w:rPr>
         <w:t xml:space="preserve"> </w:t>
       </w:r>
-      <w:proofErr w:type="spellStart"/>
-      <w:r>
-        <w:rPr>
-          <w:rFonts w:ascii="Times New Roman" w:hAnsi="Times New Roman"/>
-          <w:lang w:val="fr-FR"/>
-        </w:rPr>
-        <w:t>répéte</w:t>
-      </w:r>
-      <w:proofErr w:type="spellEnd"/>
+      <w:r>
+        <w:rPr>
+          <w:rFonts w:ascii="Times New Roman" w:hAnsi="Times New Roman"/>
+          <w:lang w:val="fr-FR"/>
+        </w:rPr>
+        <w:t>répète</w:t>
+      </w:r>
       <w:r>
         <w:rPr>
           <w:rFonts w:ascii="Times New Roman" w:hAnsi="Times New Roman"/>
@@ -1168,15 +1172,13 @@
         </w:rPr>
         <w:t xml:space="preserve"> </w:t>
       </w:r>
-      <w:proofErr w:type="gramStart"/>
-      <w:r>
-        <w:rPr>
-          <w:rFonts w:ascii="Times New Roman" w:hAnsi="Times New Roman"/>
-          <w:lang w:val="fr-FR"/>
-        </w:rPr>
-        <w:t>bien  les</w:t>
-      </w:r>
-      <w:proofErr w:type="gramEnd"/>
+      <w:r>
+        <w:rPr>
+          <w:rFonts w:ascii="Times New Roman" w:hAnsi="Times New Roman"/>
+          <w:lang w:val="fr-FR"/>
+        </w:rPr>
+        <w:t>bien les</w:t>
+      </w:r>
       <w:r>
         <w:rPr>
           <w:rFonts w:ascii="Times New Roman" w:hAnsi="Times New Roman"/>
@@ -1202,15 +1204,13 @@
         </w:rPr>
         <w:t xml:space="preserve">Par exemple, </w:t>
       </w:r>
-      <w:proofErr w:type="gramStart"/>
-      <w:r>
-        <w:rPr>
-          <w:rFonts w:ascii="Times New Roman" w:hAnsi="Times New Roman"/>
-          <w:lang w:val="fr-FR"/>
-        </w:rPr>
-        <w:t>réussite sur</w:t>
-      </w:r>
-      <w:proofErr w:type="gramEnd"/>
+      <w:r>
+        <w:rPr>
+          <w:rFonts w:ascii="Times New Roman" w:hAnsi="Times New Roman"/>
+          <w:lang w:val="fr-FR"/>
+        </w:rPr>
+        <w:t>réussite sure</w:t>
+      </w:r>
       <w:r>
         <w:rPr>
           <w:rFonts w:ascii="Times New Roman" w:hAnsi="Times New Roman"/>
@@ -1377,22 +1377,13 @@
         </w:rPr>
         <w:t xml:space="preserve"> nomme </w:t>
       </w:r>
-      <w:proofErr w:type="gramStart"/>
-      <w:r>
-        <w:rPr>
-          <w:rFonts w:ascii="Times New Roman" w:hAnsi="Times New Roman"/>
-          <w:lang w:val="fr-FR"/>
-        </w:rPr>
-        <w:t xml:space="preserve">«  </w:t>
-      </w:r>
-      <w:r>
-        <w:rPr>
-          <w:rFonts w:ascii="Times New Roman" w:hAnsi="Times New Roman"/>
-          <w:lang w:val="fr-FR"/>
-        </w:rPr>
-        <w:t>{</w:t>
-      </w:r>
-      <w:proofErr w:type="gramEnd"/>
+      <w:r>
+        <w:rPr>
+          <w:rFonts w:ascii="Times New Roman" w:hAnsi="Times New Roman"/>
+          <w:lang w:val="fr-FR"/>
+        </w:rPr>
+        <w:t>« {</w:t>
+      </w:r>
       <w:r>
         <w:rPr>
           <w:rFonts w:ascii="Times New Roman" w:hAnsi="Times New Roman"/>
@@ -1417,15 +1408,13 @@
           <w:lang w:val="fr-FR"/>
         </w:rPr>
       </w:pPr>
-      <w:proofErr w:type="gramStart"/>
-      <w:r>
-        <w:rPr>
-          <w:rFonts w:ascii="Times New Roman" w:hAnsi="Times New Roman"/>
-          <w:lang w:val="fr-FR"/>
-        </w:rPr>
-        <w:t>Par contre</w:t>
-      </w:r>
-      <w:proofErr w:type="gramEnd"/>
+      <w:r>
+        <w:rPr>
+          <w:rFonts w:ascii="Times New Roman" w:hAnsi="Times New Roman"/>
+          <w:lang w:val="fr-FR"/>
+        </w:rPr>
+        <w:t>Cependant</w:t>
+      </w:r>
       <w:r>
         <w:rPr>
           <w:rFonts w:ascii="Times New Roman" w:hAnsi="Times New Roman"/>
@@ -1604,7 +1593,6 @@
         </w:rPr>
         <w:t>{{REUSSITES_COMP_LEXICALE}} », mais pas « {{ERREURS_COMP_</w:t>
       </w:r>
-      <w:proofErr w:type="gramStart"/>
       <w:r>
         <w:rPr>
           <w:rFonts w:ascii="Times New Roman" w:hAnsi="Times New Roman"/>
@@ -1617,16 +1605,8 @@
           <w:rFonts w:ascii="Times New Roman" w:hAnsi="Times New Roman"/>
           <w:lang w:val="fr-FR"/>
         </w:rPr>
-        <w:t> </w:t>
-      </w:r>
-      <w:r>
-        <w:rPr>
-          <w:rFonts w:ascii="Times New Roman" w:hAnsi="Times New Roman"/>
-          <w:lang w:val="fr-FR"/>
-        </w:rPr>
         <w:t>}</w:t>
       </w:r>
-      <w:proofErr w:type="gramEnd"/>
       <w:r>
         <w:rPr>
           <w:rFonts w:ascii="Times New Roman" w:hAnsi="Times New Roman"/>
@@ -2404,7 +2384,6 @@
         </w:rPr>
         <w:t>{{MOTS_LUS_CORRECTEMENT</w:t>
       </w:r>
-      <w:proofErr w:type="gramStart"/>
       <w:r>
         <w:rPr>
           <w:rFonts w:ascii="Times New Roman" w:hAnsi="Times New Roman"/>
@@ -2417,9 +2396,8 @@
           <w:rFonts w:ascii="Times New Roman" w:hAnsi="Times New Roman"/>
           <w:lang w:val="fr-FR"/>
         </w:rPr>
-        <w:t>mots</w:t>
-      </w:r>
-      <w:proofErr w:type="gramEnd"/>
+        <w:t xml:space="preserve"> mots</w:t>
+      </w:r>
       <w:r>
         <w:rPr>
           <w:rFonts w:ascii="Times New Roman" w:hAnsi="Times New Roman"/>
@@ -2458,7 +2436,6 @@
         </w:rPr>
         <w:t>{{ECART_VITESSE_LECTURE}} des {{CLASSE_</w:t>
       </w:r>
-      <w:proofErr w:type="gramStart"/>
       <w:r>
         <w:rPr>
           <w:rFonts w:ascii="Times New Roman" w:hAnsi="Times New Roman"/>
@@ -2466,6 +2443,222 @@
         </w:rPr>
         <w:t>SCOLAIRE}}.</w:t>
       </w:r>
+    </w:p>
+    <w:p>
+      <w:pPr>
+        <w:pStyle w:val="Standard"/>
+        <w:ind w:right="701"/>
+        <w:jc w:val="left"/>
+        <w:rPr>
+          <w:b/>
+          <w:bCs/>
+          <w:lang w:val="fr-FR"/>
+        </w:rPr>
+      </w:pPr>
+      <w:r>
+        <w:rPr>
+          <w:rFonts w:ascii="Times New Roman" w:hAnsi="Times New Roman"/>
+          <w:b/>
+          <w:bCs/>
+          <w:lang w:val="fr-FR"/>
+        </w:rPr>
+        <w:t>{{PRONOM_SUJET_MAJ}}</w:t>
+      </w:r>
+      <w:r>
+        <w:rPr>
+          <w:rFonts w:ascii="Times New Roman" w:hAnsi="Times New Roman"/>
+          <w:b/>
+          <w:bCs/>
+          <w:lang w:val="fr-FR"/>
+        </w:rPr>
+        <w:t xml:space="preserve"> comprend le paragraphe avec un score </w:t>
+      </w:r>
+      <w:r>
+        <w:rPr>
+          <w:rFonts w:ascii="Times New Roman" w:hAnsi="Times New Roman"/>
+          <w:b/>
+          <w:bCs/>
+          <w:lang w:val="fr-FR"/>
+        </w:rPr>
+        <w:t>{{SCORE_COMP_LECTURE_TEXTE}}, score à {{ECART_COMP_LECTURE_TEXTE}} des {{CLASSE_SCOLAIRE}}.</w:t>
+      </w:r>
+    </w:p>
+    <w:p>
+      <w:pPr>
+        <w:pStyle w:val="Standard"/>
+        <w:ind w:right="701"/>
+        <w:jc w:val="left"/>
+        <w:rPr>
+          <w:rFonts w:ascii="Times New Roman" w:hAnsi="Times New Roman"/>
+          <w:b/>
+          <w:bCs/>
+          <w:lang w:val="fr-FR"/>
+        </w:rPr>
+      </w:pPr>
+      <w:r>
+        <w:rPr>
+          <w:rFonts w:ascii="Times New Roman" w:hAnsi="Times New Roman"/>
+          <w:b/>
+          <w:bCs/>
+          <w:lang w:val="fr-FR"/>
+        </w:rPr>
+        <w:t>Conclusion : {{PHRASE_COMP_LECTURE_TEXTE}}</w:t>
+      </w:r>
+    </w:p>
+    <w:p>
+      <w:pPr>
+        <w:pStyle w:val="Standard"/>
+        <w:ind w:right="701"/>
+        <w:jc w:val="left"/>
+        <w:rPr>
+          <w:b/>
+          <w:bCs/>
+          <w:lang w:val="fr-FR"/>
+        </w:rPr>
+      </w:pPr>
+    </w:p>
+    <w:p>
+      <w:pPr>
+        <w:pStyle w:val="Standard"/>
+        <w:ind w:right="701"/>
+        <w:jc w:val="left"/>
+        <w:rPr>
+          <w:b/>
+          <w:bCs/>
+          <w:lang w:val="fr-FR"/>
+        </w:rPr>
+      </w:pPr>
+      <w:r>
+        <w:rPr>
+          <w:rFonts w:ascii="Times New Roman" w:hAnsi="Times New Roman"/>
+          <w:b/>
+          <w:bCs/>
+          <w:lang w:val="fr-FR"/>
+        </w:rPr>
+        <w:t>Orthographe</w:t>
+      </w:r>
+    </w:p>
+    <w:p>
+      <w:pPr>
+        <w:pStyle w:val="Standard"/>
+        <w:ind w:right="701"/>
+        <w:jc w:val="left"/>
+        <w:rPr>
+          <w:lang w:val="fr-FR"/>
+        </w:rPr>
+      </w:pPr>
+      <w:r>
+        <w:rPr>
+          <w:rFonts w:ascii="Times New Roman" w:hAnsi="Times New Roman"/>
+          <w:lang w:val="fr-FR"/>
+        </w:rPr>
+        <w:t>{{PRENOM_PATIENT}}</w:t>
+      </w:r>
+      <w:r>
+        <w:rPr>
+          <w:rFonts w:ascii="Times New Roman" w:hAnsi="Times New Roman"/>
+          <w:lang w:val="fr-FR"/>
+        </w:rPr>
+        <w:t xml:space="preserve"> peut écrire des lettres : score </w:t>
+      </w:r>
+      <w:r>
+        <w:rPr>
+          <w:rFonts w:ascii="Times New Roman" w:hAnsi="Times New Roman"/>
+          <w:lang w:val="fr-FR"/>
+        </w:rPr>
+        <w:t>{{SCORE_ORTHO_LETTRES}}</w:t>
+      </w:r>
+      <w:r>
+        <w:rPr>
+          <w:rFonts w:ascii="Times New Roman" w:hAnsi="Times New Roman"/>
+          <w:lang w:val="fr-FR"/>
+        </w:rPr>
+        <w:t xml:space="preserve">, sauf </w:t>
+      </w:r>
+      <w:r>
+        <w:rPr>
+          <w:rFonts w:ascii="Times New Roman" w:hAnsi="Times New Roman"/>
+          <w:lang w:val="fr-FR"/>
+        </w:rPr>
+        <w:t>{{CONFUSIONS_ORTHO_LETTRES}}.</w:t>
+      </w:r>
+    </w:p>
+    <w:p>
+      <w:pPr>
+        <w:pStyle w:val="Standard"/>
+        <w:ind w:right="701"/>
+        <w:jc w:val="left"/>
+        <w:rPr>
+          <w:rFonts w:ascii="Times New Roman" w:hAnsi="Times New Roman"/>
+          <w:lang w:val="fr-FR"/>
+        </w:rPr>
+      </w:pPr>
+      <w:r>
+        <w:rPr>
+          <w:rFonts w:ascii="Times New Roman" w:hAnsi="Times New Roman"/>
+          <w:lang w:val="fr-FR"/>
+        </w:rPr>
+        <w:t>{{PRONOM_SUJET_MAJ}}</w:t>
+      </w:r>
+      <w:r>
+        <w:rPr>
+          <w:rFonts w:ascii="Times New Roman" w:hAnsi="Times New Roman"/>
+          <w:lang w:val="fr-FR"/>
+        </w:rPr>
+        <w:t xml:space="preserve"> écrit les syllabes : </w:t>
+      </w:r>
+      <w:r>
+        <w:rPr>
+          <w:rFonts w:ascii="Times New Roman" w:hAnsi="Times New Roman"/>
+          <w:lang w:val="fr-FR"/>
+        </w:rPr>
+        <w:t>{{PRONOM_SUJET}}</w:t>
+      </w:r>
+      <w:r>
+        <w:rPr>
+          <w:rFonts w:ascii="Times New Roman" w:hAnsi="Times New Roman"/>
+          <w:lang w:val="fr-FR"/>
+        </w:rPr>
+        <w:t xml:space="preserve"> réussit </w:t>
+      </w:r>
+      <w:r>
+        <w:rPr>
+          <w:rFonts w:ascii="Times New Roman" w:hAnsi="Times New Roman"/>
+          <w:lang w:val="fr-FR"/>
+        </w:rPr>
+        <w:t>{{SCORE_ORTHO_SYLLABES}}. Exemples d'erreurs : {{ERREURS_ORTHO_SYLLABES}}.</w:t>
+      </w:r>
+    </w:p>
+    <w:p>
+      <w:pPr>
+        <w:pStyle w:val="Standard"/>
+        <w:ind w:right="701"/>
+        <w:jc w:val="left"/>
+        <w:rPr>
+          <w:lang w:val="fr-FR"/>
+        </w:rPr>
+      </w:pPr>
+      <w:r>
+        <w:rPr>
+          <w:rFonts w:ascii="Times New Roman" w:hAnsi="Times New Roman"/>
+          <w:lang w:val="fr-FR"/>
+        </w:rPr>
+        <w:t xml:space="preserve">Confusions avec les sons </w:t>
+      </w:r>
+      <w:r>
+        <w:rPr>
+          <w:rFonts w:ascii="Times New Roman" w:hAnsi="Times New Roman"/>
+          <w:lang w:val="fr-FR"/>
+        </w:rPr>
+        <w:t>{{CONFUSIONS_SONS_</w:t>
+      </w:r>
+      <w:r>
+        <w:rPr>
+          <w:rFonts w:ascii="Times New Roman" w:hAnsi="Times New Roman"/>
+          <w:lang w:val="fr-FR"/>
+        </w:rPr>
+        <w:t>ORTHO}}</w:t>
+      </w:r>
       <w:r>
         <w:rPr>
           <w:rFonts w:ascii="Times New Roman" w:hAnsi="Times New Roman"/>
@@ -2473,232 +2666,6 @@
         </w:rPr>
         <w:t>.</w:t>
       </w:r>
-      <w:proofErr w:type="gramEnd"/>
-    </w:p>
-    <w:p>
-      <w:pPr>
-        <w:pStyle w:val="Standard"/>
-        <w:ind w:right="701"/>
-        <w:jc w:val="left"/>
-        <w:rPr>
-          <w:b/>
-          <w:bCs/>
-          <w:lang w:val="fr-FR"/>
-        </w:rPr>
-      </w:pPr>
-      <w:r>
-        <w:rPr>
-          <w:rFonts w:ascii="Times New Roman" w:hAnsi="Times New Roman"/>
-          <w:b/>
-          <w:bCs/>
-          <w:lang w:val="fr-FR"/>
-        </w:rPr>
-        <w:t>{{PRONOM_SUJET_MAJ}}</w:t>
-      </w:r>
-      <w:r>
-        <w:rPr>
-          <w:rFonts w:ascii="Times New Roman" w:hAnsi="Times New Roman"/>
-          <w:b/>
-          <w:bCs/>
-          <w:lang w:val="fr-FR"/>
-        </w:rPr>
-        <w:t xml:space="preserve"> comprend le paragraphe avec un score </w:t>
-      </w:r>
-      <w:r>
-        <w:rPr>
-          <w:rFonts w:ascii="Times New Roman" w:hAnsi="Times New Roman"/>
-          <w:b/>
-          <w:bCs/>
-          <w:lang w:val="fr-FR"/>
-        </w:rPr>
-        <w:t>{{SCORE_COMP_LECTURE_TEXTE}}, score à {{ECART_COMP_LECTURE_TEXTE}} des {{CLASSE_SCOLAIRE}}.</w:t>
-      </w:r>
-    </w:p>
-    <w:p>
-      <w:pPr>
-        <w:pStyle w:val="Standard"/>
-        <w:ind w:right="701"/>
-        <w:jc w:val="left"/>
-        <w:rPr>
-          <w:rFonts w:ascii="Times New Roman" w:hAnsi="Times New Roman"/>
-          <w:b/>
-          <w:bCs/>
-          <w:lang w:val="fr-FR"/>
-        </w:rPr>
-      </w:pPr>
-      <w:r>
-        <w:rPr>
-          <w:rFonts w:ascii="Times New Roman" w:hAnsi="Times New Roman"/>
-          <w:b/>
-          <w:bCs/>
-          <w:lang w:val="fr-FR"/>
-        </w:rPr>
-        <w:t>Conclusion : {{PHRASE_COMP_LECTURE_TEXTE}}</w:t>
-      </w:r>
-    </w:p>
-    <w:p>
-      <w:pPr>
-        <w:pStyle w:val="Standard"/>
-        <w:ind w:right="701"/>
-        <w:jc w:val="left"/>
-        <w:rPr>
-          <w:b/>
-          <w:bCs/>
-          <w:lang w:val="fr-FR"/>
-        </w:rPr>
-      </w:pPr>
-    </w:p>
-    <w:p>
-      <w:pPr>
-        <w:pStyle w:val="Standard"/>
-        <w:ind w:right="701"/>
-        <w:jc w:val="left"/>
-        <w:rPr>
-          <w:b/>
-          <w:bCs/>
-          <w:lang w:val="fr-FR"/>
-        </w:rPr>
-      </w:pPr>
-      <w:r>
-        <w:rPr>
-          <w:rFonts w:ascii="Times New Roman" w:hAnsi="Times New Roman"/>
-          <w:b/>
-          <w:bCs/>
-          <w:lang w:val="fr-FR"/>
-        </w:rPr>
-        <w:t>Orthographe</w:t>
-      </w:r>
-    </w:p>
-    <w:p>
-      <w:pPr>
-        <w:pStyle w:val="Standard"/>
-        <w:ind w:right="701"/>
-        <w:jc w:val="left"/>
-        <w:rPr>
-          <w:lang w:val="fr-FR"/>
-        </w:rPr>
-      </w:pPr>
-      <w:r>
-        <w:rPr>
-          <w:rFonts w:ascii="Times New Roman" w:hAnsi="Times New Roman"/>
-          <w:lang w:val="fr-FR"/>
-        </w:rPr>
-        <w:t>{{PRENOM_PATIENT}}</w:t>
-      </w:r>
-      <w:r>
-        <w:rPr>
-          <w:rFonts w:ascii="Times New Roman" w:hAnsi="Times New Roman"/>
-          <w:lang w:val="fr-FR"/>
-        </w:rPr>
-        <w:t xml:space="preserve"> peut écrire des lettres : score </w:t>
-      </w:r>
-      <w:r>
-        <w:rPr>
-          <w:rFonts w:ascii="Times New Roman" w:hAnsi="Times New Roman"/>
-          <w:lang w:val="fr-FR"/>
-        </w:rPr>
-        <w:t>{{SCORE_ORTHO_LETTRES}}</w:t>
-      </w:r>
-      <w:r>
-        <w:rPr>
-          <w:rFonts w:ascii="Times New Roman" w:hAnsi="Times New Roman"/>
-          <w:lang w:val="fr-FR"/>
-        </w:rPr>
-        <w:t xml:space="preserve">, sauf </w:t>
-      </w:r>
-      <w:r>
-        <w:rPr>
-          <w:rFonts w:ascii="Times New Roman" w:hAnsi="Times New Roman"/>
-          <w:lang w:val="fr-FR"/>
-        </w:rPr>
-        <w:t>{{CONFUSIONS_ORTHO_LETTRES}}.</w:t>
-      </w:r>
-    </w:p>
-    <w:p>
-      <w:pPr>
-        <w:pStyle w:val="Standard"/>
-        <w:ind w:right="701"/>
-        <w:jc w:val="left"/>
-        <w:rPr>
-          <w:rFonts w:ascii="Times New Roman" w:hAnsi="Times New Roman"/>
-          <w:lang w:val="fr-FR"/>
-        </w:rPr>
-      </w:pPr>
-      <w:r>
-        <w:rPr>
-          <w:rFonts w:ascii="Times New Roman" w:hAnsi="Times New Roman"/>
-          <w:lang w:val="fr-FR"/>
-        </w:rPr>
-        <w:t>{{PRONOM_SUJET_MAJ}}</w:t>
-      </w:r>
-      <w:r>
-        <w:rPr>
-          <w:rFonts w:ascii="Times New Roman" w:hAnsi="Times New Roman"/>
-          <w:lang w:val="fr-FR"/>
-        </w:rPr>
-        <w:t xml:space="preserve"> écrit les syllabes : </w:t>
-      </w:r>
-      <w:r>
-        <w:rPr>
-          <w:rFonts w:ascii="Times New Roman" w:hAnsi="Times New Roman"/>
-          <w:lang w:val="fr-FR"/>
-        </w:rPr>
-        <w:t>{{PRONOM_SUJET}}</w:t>
-      </w:r>
-      <w:r>
-        <w:rPr>
-          <w:rFonts w:ascii="Times New Roman" w:hAnsi="Times New Roman"/>
-          <w:lang w:val="fr-FR"/>
-        </w:rPr>
-        <w:t xml:space="preserve"> réussit </w:t>
-      </w:r>
-      <w:r>
-        <w:rPr>
-          <w:rFonts w:ascii="Times New Roman" w:hAnsi="Times New Roman"/>
-          <w:lang w:val="fr-FR"/>
-        </w:rPr>
-        <w:t>{{SCORE_ORTHO_SYLLABES}}. Exemples d'erreurs : {{ERREURS_ORTHO_SYLLABES}}.</w:t>
-      </w:r>
-    </w:p>
-    <w:p>
-      <w:pPr>
-        <w:pStyle w:val="Standard"/>
-        <w:ind w:right="701"/>
-        <w:jc w:val="left"/>
-        <w:rPr>
-          <w:lang w:val="fr-FR"/>
-        </w:rPr>
-      </w:pPr>
-      <w:r>
-        <w:rPr>
-          <w:rFonts w:ascii="Times New Roman" w:hAnsi="Times New Roman"/>
-          <w:lang w:val="fr-FR"/>
-        </w:rPr>
-        <w:t xml:space="preserve">Confusions avec les sons </w:t>
-      </w:r>
-      <w:r>
-        <w:rPr>
-          <w:rFonts w:ascii="Times New Roman" w:hAnsi="Times New Roman"/>
-          <w:lang w:val="fr-FR"/>
-        </w:rPr>
-        <w:t>{{CONFUSIONS_SONS_</w:t>
-      </w:r>
-      <w:proofErr w:type="gramStart"/>
-      <w:r>
-        <w:rPr>
-          <w:rFonts w:ascii="Times New Roman" w:hAnsi="Times New Roman"/>
-          <w:lang w:val="fr-FR"/>
-        </w:rPr>
-        <w:t>ORTHO}}.</w:t>
-      </w:r>
-      <w:r>
-        <w:rPr>
-          <w:rFonts w:ascii="Times New Roman" w:hAnsi="Times New Roman"/>
-          <w:lang w:val="fr-FR"/>
-        </w:rPr>
-        <w:t>.</w:t>
-      </w:r>
-      <w:proofErr w:type="gramEnd"/>
     </w:p>
     <w:p>
       <w:pPr>
@@ -3482,6 +3449,34 @@
         <w:rPr>
           <w:rFonts w:ascii="Times New Roman" w:hAnsi="Times New Roman"/>
           <w:bCs/>
+          <w:lang w:val="fr-FR"/>
+        </w:rPr>
+        <w:t>.</w:t>
+      </w:r>
+      <w:r>
+        <w:rPr>
+          <w:rFonts w:ascii="Times New Roman" w:hAnsi="Times New Roman"/>
+          <w:bCs/>
+          <w:lang w:val="fr-FR"/>
+        </w:rPr>
+        <w:br/>
+      </w:r>
+      <w:r>
+        <w:rPr>
+          <w:rFonts w:ascii="Times New Roman" w:hAnsi="Times New Roman"/>
+          <w:bCs/>
+          <w:lang w:val="fr-FR"/>
+        </w:rPr>
+        <w:br/>
+      </w:r>
+      <w:r>
+        <w:rPr>
+          <w:lang w:val="fr-FR"/>
+        </w:rPr>
+        <w:t>ORIENTATIONS ET AMÉNAGEMENTS {{ORIENTATIONS_PAP_ULIS}}</w:t>
+      </w:r>
+      <w:r>
+        <w:rPr>
           <w:lang w:val="fr-FR"/>
         </w:rPr>
         <w:t>.</w:t>
@@ -4367,7 +4362,6 @@
   <w:style w:type="character" w:default="1" w:styleId="Policepardfaut">
     <w:name w:val="Default Paragraph Font"/>
     <w:uiPriority w:val="1"/>
-    <w:semiHidden/>
     <w:unhideWhenUsed/>
   </w:style>
   <w:style w:type="table" w:default="1" w:styleId="TableauNormal">

</xml_diff>